<commit_message>
Update branding text in index.html and enhance project documentation for login page design
</commit_message>
<xml_diff>
--- a/Software Engineering Group Project.docx
+++ b/Software Engineering Group Project.docx
@@ -572,7 +572,58 @@
       </w:r>
       <w:bookmarkEnd w:id="0"/>
     </w:p>
-    <w:p/>
+    <w:p>
+      <w:r>
+        <w:t>The login wireframe as you can see it is an early design sketch just to visualise how we want the login page to look like in the final iteration.</w:t>
+      </w:r>
+    </w:p>
+    <w:p>
+      <w:pPr>
+        <w:jc w:val="center"/>
+      </w:pPr>
+      <w:r>
+        <w:drawing>
+          <wp:inline distT="0" distB="0" distL="0" distR="0" wp14:anchorId="493C8AE1" wp14:editId="29A6C685">
+            <wp:extent cx="5695277" cy="3194050"/>
+            <wp:effectExtent l="0" t="0" r="1270" b="6350"/>
+            <wp:docPr id="268007236" name="Picture 1" descr="A screenshot of a log in page&#10;&#10;AI-generated content may be incorrect."/>
+            <wp:cNvGraphicFramePr>
+              <a:graphicFrameLocks xmlns:a="http://schemas.openxmlformats.org/drawingml/2006/main" noChangeAspect="1"/>
+            </wp:cNvGraphicFramePr>
+            <a:graphic xmlns:a="http://schemas.openxmlformats.org/drawingml/2006/main">
+              <a:graphicData uri="http://schemas.openxmlformats.org/drawingml/2006/picture">
+                <pic:pic xmlns:pic="http://schemas.openxmlformats.org/drawingml/2006/picture">
+                  <pic:nvPicPr>
+                    <pic:cNvPr id="268007236" name="Picture 1" descr="A screenshot of a log in page&#10;&#10;AI-generated content may be incorrect."/>
+                    <pic:cNvPicPr/>
+                  </pic:nvPicPr>
+                  <pic:blipFill>
+                    <a:blip r:embed="rId8"/>
+                    <a:stretch>
+                      <a:fillRect/>
+                    </a:stretch>
+                  </pic:blipFill>
+                  <pic:spPr>
+                    <a:xfrm>
+                      <a:off x="0" y="0"/>
+                      <a:ext cx="5698093" cy="3195629"/>
+                    </a:xfrm>
+                    <a:prstGeom prst="rect">
+                      <a:avLst/>
+                    </a:prstGeom>
+                  </pic:spPr>
+                </pic:pic>
+              </a:graphicData>
+            </a:graphic>
+          </wp:inline>
+        </w:drawing>
+      </w:r>
+    </w:p>
+    <w:p>
+      <w:r>
+        <w:t>Wireframe 2 – Login</w:t>
+      </w:r>
+    </w:p>
     <w:p>
       <w:pPr>
         <w:pStyle w:val="Heading1"/>
@@ -615,7 +666,58 @@
       <w:bookmarkEnd w:id="1"/>
       <w:bookmarkEnd w:id="2"/>
     </w:p>
-    <w:p/>
+    <w:p>
+      <w:r>
+        <w:t>As you can see this is the prototype for the login page that we’ve came up with after doing the wireframe sketch, as visible here we went more in detail as we have a logo, with the name of our system, there are different buttons for login and register, also we’ve implemented the Login button that allows users to enter the system, 2 text boxes for email and password and a view password symbol which allows the users to check their password is good.</w:t>
+      </w:r>
+    </w:p>
+    <w:p>
+      <w:pPr>
+        <w:jc w:val="center"/>
+      </w:pPr>
+      <w:r>
+        <w:drawing>
+          <wp:inline distT="0" distB="0" distL="0" distR="0" wp14:anchorId="30D1BFA7" wp14:editId="4A58EF05">
+            <wp:extent cx="5568950" cy="2920212"/>
+            <wp:effectExtent l="0" t="0" r="0" b="0"/>
+            <wp:docPr id="1433698409" name="Picture 1" descr="A screenshot of a computer&#10;&#10;AI-generated content may be incorrect."/>
+            <wp:cNvGraphicFramePr>
+              <a:graphicFrameLocks xmlns:a="http://schemas.openxmlformats.org/drawingml/2006/main" noChangeAspect="1"/>
+            </wp:cNvGraphicFramePr>
+            <a:graphic xmlns:a="http://schemas.openxmlformats.org/drawingml/2006/main">
+              <a:graphicData uri="http://schemas.openxmlformats.org/drawingml/2006/picture">
+                <pic:pic xmlns:pic="http://schemas.openxmlformats.org/drawingml/2006/picture">
+                  <pic:nvPicPr>
+                    <pic:cNvPr id="1433698409" name="Picture 1" descr="A screenshot of a computer&#10;&#10;AI-generated content may be incorrect."/>
+                    <pic:cNvPicPr/>
+                  </pic:nvPicPr>
+                  <pic:blipFill>
+                    <a:blip r:embed="rId9"/>
+                    <a:stretch>
+                      <a:fillRect/>
+                    </a:stretch>
+                  </pic:blipFill>
+                  <pic:spPr>
+                    <a:xfrm>
+                      <a:off x="0" y="0"/>
+                      <a:ext cx="5603052" cy="2938094"/>
+                    </a:xfrm>
+                    <a:prstGeom prst="rect">
+                      <a:avLst/>
+                    </a:prstGeom>
+                  </pic:spPr>
+                </pic:pic>
+              </a:graphicData>
+            </a:graphic>
+          </wp:inline>
+        </w:drawing>
+      </w:r>
+    </w:p>
+    <w:p>
+      <w:r>
+        <w:t>Prototype 2 - Login</w:t>
+      </w:r>
+    </w:p>
     <w:p>
       <w:pPr>
         <w:pStyle w:val="Heading1"/>
@@ -634,6 +736,7 @@
           <w:sz w:val="30"/>
           <w:szCs w:val="30"/>
         </w:rPr>
+        <w:lastRenderedPageBreak/>
         <w:t xml:space="preserve">SPRINT </w:t>
       </w:r>
       <w:r>
@@ -690,8 +793,8 @@
     </w:p>
     <w:p/>
     <w:sectPr>
-      <w:headerReference w:type="default" r:id="rId8"/>
-      <w:footerReference w:type="default" r:id="rId9"/>
+      <w:headerReference w:type="default" r:id="rId10"/>
+      <w:footerReference w:type="default" r:id="rId11"/>
       <w:pgSz w:w="11906" w:h="16838"/>
       <w:pgMar w:top="1440" w:right="1440" w:bottom="1440" w:left="1440" w:header="708" w:footer="708" w:gutter="0"/>
       <w:pgNumType w:start="0"/>

</xml_diff>

<commit_message>
Update references in project documentation for login page prototype
</commit_message>
<xml_diff>
--- a/Software Engineering Group Project.docx
+++ b/Software Engineering Group Project.docx
@@ -582,6 +582,9 @@
         <w:jc w:val="center"/>
       </w:pPr>
       <w:r>
+        <w:rPr>
+          <w:noProof/>
+        </w:rPr>
         <w:drawing>
           <wp:inline distT="0" distB="0" distL="0" distR="0" wp14:anchorId="493C8AE1" wp14:editId="29A6C685">
             <wp:extent cx="5695277" cy="3194050"/>
@@ -676,6 +679,9 @@
         <w:jc w:val="center"/>
       </w:pPr>
       <w:r>
+        <w:rPr>
+          <w:noProof/>
+        </w:rPr>
         <w:drawing>
           <wp:inline distT="0" distB="0" distL="0" distR="0" wp14:anchorId="30D1BFA7" wp14:editId="4A58EF05">
             <wp:extent cx="5568950" cy="2920212"/>
@@ -790,6 +796,24 @@
         <w:t>:</w:t>
       </w:r>
       <w:bookmarkEnd w:id="4"/>
+      <w:r>
+        <w:rPr>
+          <w:rFonts w:asciiTheme="minorHAnsi" w:hAnsiTheme="minorHAnsi" w:cstheme="minorHAnsi"/>
+          <w:color w:val="auto"/>
+          <w:sz w:val="30"/>
+          <w:szCs w:val="30"/>
+        </w:rPr>
+        <w:t xml:space="preserve"> </w:t>
+      </w:r>
+      <w:r>
+        <w:rPr>
+          <w:rFonts w:asciiTheme="minorHAnsi" w:hAnsiTheme="minorHAnsi" w:cstheme="minorHAnsi"/>
+          <w:color w:val="auto"/>
+          <w:sz w:val="30"/>
+          <w:szCs w:val="30"/>
+        </w:rPr>
+        <w:t>https://www.webtomed.com/blog/best-hospital-website-design.html</w:t>
+      </w:r>
     </w:p>
     <w:p/>
     <w:sectPr>
@@ -4440,7 +4464,7 @@
       </w:tcPr>
     </w:tblStylePr>
   </w:style>
-  <w:style w:type="table" w:styleId="ListTable6ColourfulAccent2">
+  <w:style w:type="table" w:styleId="ListTable6Colorful-Accent2">
     <w:name w:val="List Table 6 Colorful Accent 2"/>
     <w:basedOn w:val="TableNormal"/>
     <w:uiPriority w:val="51"/>

</xml_diff>

<commit_message>
Enhance project documentation with detailed descriptions of registration and login prototypes, including wireframes and design improvements.
</commit_message>
<xml_diff>
--- a/Software Engineering Group Project.docx
+++ b/Software Engineering Group Project.docx
@@ -574,6 +574,69 @@
     </w:p>
     <w:p>
       <w:r>
+        <w:t>The sketch below shows the registration page as wireframe for our system to visualise how the final product will look like.</w:t>
+      </w:r>
+    </w:p>
+    <w:p>
+      <w:r>
+        <w:drawing>
+          <wp:inline distT="0" distB="0" distL="0" distR="0" wp14:anchorId="510DA8DB" wp14:editId="5D75DC23">
+            <wp:extent cx="5731510" cy="3185795"/>
+            <wp:effectExtent l="0" t="0" r="2540" b="0"/>
+            <wp:docPr id="1323055908" name="Picture 1" descr="A screenshot of a login form&#10;&#10;AI-generated content may be incorrect."/>
+            <wp:cNvGraphicFramePr>
+              <a:graphicFrameLocks xmlns:a="http://schemas.openxmlformats.org/drawingml/2006/main" noChangeAspect="1"/>
+            </wp:cNvGraphicFramePr>
+            <a:graphic xmlns:a="http://schemas.openxmlformats.org/drawingml/2006/main">
+              <a:graphicData uri="http://schemas.openxmlformats.org/drawingml/2006/picture">
+                <pic:pic xmlns:pic="http://schemas.openxmlformats.org/drawingml/2006/picture">
+                  <pic:nvPicPr>
+                    <pic:cNvPr id="1323055908" name="Picture 1" descr="A screenshot of a login form&#10;&#10;AI-generated content may be incorrect."/>
+                    <pic:cNvPicPr/>
+                  </pic:nvPicPr>
+                  <pic:blipFill>
+                    <a:blip r:embed="rId8"/>
+                    <a:stretch>
+                      <a:fillRect/>
+                    </a:stretch>
+                  </pic:blipFill>
+                  <pic:spPr>
+                    <a:xfrm>
+                      <a:off x="0" y="0"/>
+                      <a:ext cx="5731510" cy="3185795"/>
+                    </a:xfrm>
+                    <a:prstGeom prst="rect">
+                      <a:avLst/>
+                    </a:prstGeom>
+                  </pic:spPr>
+                </pic:pic>
+              </a:graphicData>
+            </a:graphic>
+          </wp:inline>
+        </w:drawing>
+      </w:r>
+    </w:p>
+    <w:p>
+      <w:pPr>
+        <w:rPr>
+          <w:b/>
+          <w:bCs/>
+          <w:i/>
+          <w:iCs/>
+        </w:rPr>
+      </w:pPr>
+      <w:r>
+        <w:rPr>
+          <w:b/>
+          <w:bCs/>
+          <w:i/>
+          <w:iCs/>
+        </w:rPr>
+        <w:t>Wireframe 1 - Register</w:t>
+      </w:r>
+    </w:p>
+    <w:p>
+      <w:r>
         <w:t>The login wireframe as you can see it is an early design sketch just to visualise how we want the login page to look like in the final iteration.</w:t>
       </w:r>
     </w:p>
@@ -601,7 +664,7 @@
                     <pic:cNvPicPr/>
                   </pic:nvPicPr>
                   <pic:blipFill>
-                    <a:blip r:embed="rId8"/>
+                    <a:blip r:embed="rId9"/>
                     <a:stretch>
                       <a:fillRect/>
                     </a:stretch>
@@ -623,7 +686,21 @@
       </w:r>
     </w:p>
     <w:p>
+      <w:pPr>
+        <w:rPr>
+          <w:b/>
+          <w:bCs/>
+          <w:i/>
+          <w:iCs/>
+        </w:rPr>
+      </w:pPr>
       <w:r>
+        <w:rPr>
+          <w:b/>
+          <w:bCs/>
+          <w:i/>
+          <w:iCs/>
+        </w:rPr>
         <w:t>Wireframe 2 – Login</w:t>
       </w:r>
     </w:p>
@@ -646,6 +723,7 @@
           <w:sz w:val="30"/>
           <w:szCs w:val="30"/>
         </w:rPr>
+        <w:lastRenderedPageBreak/>
         <w:t>SPRINT</w:t>
       </w:r>
       <w:r>
@@ -671,6 +749,72 @@
     </w:p>
     <w:p>
       <w:r>
+        <w:t>As you can see the prototype for the registration page is different from the wireframe sketch and that is because it looks more professional, as you can see there are 4 different text boxes that are asking for email, password, date of birth and phone number, the password has a view password symbol where users are able to see their password and check it, additionally the data of birth has a calendar so you can select what day, month and year you are born. Further, we’ve added a logo with the name of our system and a create account button</w:t>
+      </w:r>
+      <w:r>
+        <w:t>.</w:t>
+      </w:r>
+    </w:p>
+    <w:p>
+      <w:r>
+        <w:drawing>
+          <wp:inline distT="0" distB="0" distL="0" distR="0" wp14:anchorId="140AE605" wp14:editId="01270977">
+            <wp:extent cx="5645150" cy="2970802"/>
+            <wp:effectExtent l="0" t="0" r="0" b="1270"/>
+            <wp:docPr id="891724062" name="Picture 1" descr="A screenshot of a computer&#10;&#10;AI-generated content may be incorrect."/>
+            <wp:cNvGraphicFramePr>
+              <a:graphicFrameLocks xmlns:a="http://schemas.openxmlformats.org/drawingml/2006/main" noChangeAspect="1"/>
+            </wp:cNvGraphicFramePr>
+            <a:graphic xmlns:a="http://schemas.openxmlformats.org/drawingml/2006/main">
+              <a:graphicData uri="http://schemas.openxmlformats.org/drawingml/2006/picture">
+                <pic:pic xmlns:pic="http://schemas.openxmlformats.org/drawingml/2006/picture">
+                  <pic:nvPicPr>
+                    <pic:cNvPr id="891724062" name="Picture 1" descr="A screenshot of a computer&#10;&#10;AI-generated content may be incorrect."/>
+                    <pic:cNvPicPr/>
+                  </pic:nvPicPr>
+                  <pic:blipFill>
+                    <a:blip r:embed="rId10"/>
+                    <a:stretch>
+                      <a:fillRect/>
+                    </a:stretch>
+                  </pic:blipFill>
+                  <pic:spPr>
+                    <a:xfrm>
+                      <a:off x="0" y="0"/>
+                      <a:ext cx="5648402" cy="2972513"/>
+                    </a:xfrm>
+                    <a:prstGeom prst="rect">
+                      <a:avLst/>
+                    </a:prstGeom>
+                  </pic:spPr>
+                </pic:pic>
+              </a:graphicData>
+            </a:graphic>
+          </wp:inline>
+        </w:drawing>
+      </w:r>
+    </w:p>
+    <w:p>
+      <w:pPr>
+        <w:rPr>
+          <w:b/>
+          <w:bCs/>
+          <w:i/>
+          <w:iCs/>
+        </w:rPr>
+      </w:pPr>
+      <w:r>
+        <w:rPr>
+          <w:b/>
+          <w:bCs/>
+          <w:i/>
+          <w:iCs/>
+        </w:rPr>
+        <w:t>Prototype 1 - Register</w:t>
+      </w:r>
+    </w:p>
+    <w:p>
+      <w:r>
         <w:t>As you can see this is the prototype for the login page that we’ve came up with after doing the wireframe sketch, as visible here we went more in detail as we have a logo, with the name of our system, there are different buttons for login and register, also we’ve implemented the Login button that allows users to enter the system, 2 text boxes for email and password and a view password symbol which allows the users to check their password is good.</w:t>
       </w:r>
     </w:p>
@@ -698,7 +842,7 @@
                     <pic:cNvPicPr/>
                   </pic:nvPicPr>
                   <pic:blipFill>
-                    <a:blip r:embed="rId9"/>
+                    <a:blip r:embed="rId11"/>
                     <a:stretch>
                       <a:fillRect/>
                     </a:stretch>
@@ -720,8 +864,41 @@
       </w:r>
     </w:p>
     <w:p>
+      <w:pPr>
+        <w:rPr>
+          <w:b/>
+          <w:bCs/>
+          <w:i/>
+          <w:iCs/>
+        </w:rPr>
+      </w:pPr>
       <w:r>
-        <w:t>Prototype 2 - Login</w:t>
+        <w:rPr>
+          <w:b/>
+          <w:bCs/>
+          <w:i/>
+          <w:iCs/>
+        </w:rPr>
+        <w:lastRenderedPageBreak/>
+        <w:t xml:space="preserve">Prototype 2 </w:t>
+      </w:r>
+      <w:r>
+        <w:rPr>
+          <w:b/>
+          <w:bCs/>
+          <w:i/>
+          <w:iCs/>
+        </w:rPr>
+        <w:t>–</w:t>
+      </w:r>
+      <w:r>
+        <w:rPr>
+          <w:b/>
+          <w:bCs/>
+          <w:i/>
+          <w:iCs/>
+        </w:rPr>
+        <w:t xml:space="preserve"> Login</w:t>
       </w:r>
     </w:p>
     <w:p>
@@ -742,7 +919,6 @@
           <w:sz w:val="30"/>
           <w:szCs w:val="30"/>
         </w:rPr>
-        <w:lastRenderedPageBreak/>
         <w:t xml:space="preserve">SPRINT </w:t>
       </w:r>
       <w:r>
@@ -796,29 +972,11 @@
         <w:t>:</w:t>
       </w:r>
       <w:bookmarkEnd w:id="4"/>
-      <w:r>
-        <w:rPr>
-          <w:rFonts w:asciiTheme="minorHAnsi" w:hAnsiTheme="minorHAnsi" w:cstheme="minorHAnsi"/>
-          <w:color w:val="auto"/>
-          <w:sz w:val="30"/>
-          <w:szCs w:val="30"/>
-        </w:rPr>
-        <w:t xml:space="preserve"> </w:t>
-      </w:r>
-      <w:r>
-        <w:rPr>
-          <w:rFonts w:asciiTheme="minorHAnsi" w:hAnsiTheme="minorHAnsi" w:cstheme="minorHAnsi"/>
-          <w:color w:val="auto"/>
-          <w:sz w:val="30"/>
-          <w:szCs w:val="30"/>
-        </w:rPr>
-        <w:t>https://www.webtomed.com/blog/best-hospital-website-design.html</w:t>
-      </w:r>
     </w:p>
     <w:p/>
     <w:sectPr>
-      <w:headerReference w:type="default" r:id="rId10"/>
-      <w:footerReference w:type="default" r:id="rId11"/>
+      <w:headerReference w:type="default" r:id="rId12"/>
+      <w:footerReference w:type="default" r:id="rId13"/>
       <w:pgSz w:w="11906" w:h="16838"/>
       <w:pgMar w:top="1440" w:right="1440" w:bottom="1440" w:left="1440" w:header="708" w:footer="708" w:gutter="0"/>
       <w:pgNumType w:start="0"/>
@@ -4464,7 +4622,7 @@
       </w:tcPr>
     </w:tblStylePr>
   </w:style>
-  <w:style w:type="table" w:styleId="ListTable6Colorful-Accent2">
+  <w:style w:type="table" w:styleId="ListTable6ColourfulAccent2">
     <w:name w:val="List Table 6 Colorful Accent 2"/>
     <w:basedOn w:val="TableNormal"/>
     <w:uiPriority w:val="51"/>

</xml_diff>

<commit_message>
Add Sprint 1 summary detailing project foundation, feature planning, and team responsibilities
</commit_message>
<xml_diff>
--- a/Software Engineering Group Project.docx
+++ b/Software Engineering Group Project.docx
@@ -572,6 +572,90 @@
       </w:r>
       <w:bookmarkEnd w:id="0"/>
     </w:p>
+    <w:p/>
+    <w:p>
+      <w:pPr>
+        <w:rPr>
+          <w:color w:val="ED7D31" w:themeColor="accent2"/>
+          <w:sz w:val="24"/>
+          <w:szCs w:val="24"/>
+        </w:rPr>
+      </w:pPr>
+      <w:r>
+        <w:rPr>
+          <w:color w:val="ED7D31" w:themeColor="accent2"/>
+          <w:sz w:val="24"/>
+          <w:szCs w:val="24"/>
+        </w:rPr>
+        <w:t>Summary for the sprint 1:</w:t>
+      </w:r>
+    </w:p>
+    <w:p>
+      <w:pPr>
+        <w:rPr>
+          <w:lang w:val="en-US"/>
+        </w:rPr>
+      </w:pPr>
+      <w:r>
+        <w:rPr>
+          <w:lang w:val="en-US"/>
+        </w:rPr>
+        <w:t>our group focused on laying a strong foundation for the project by clearly defining the core features and organizing team responsibilities. We began by discussing the overall functionality of the system and identifying the essential components required for it to operate efficiently. One of the primary features we planned was the ability for users to book appointments with different types of doctors. To support this, we defined various doctor categories and agreed that each doctor would have an individual profile containing relevant information such as specialization and availability. This ensures that users can easily choose the appropriate doctor based on their needs.</w:t>
+      </w:r>
+    </w:p>
+    <w:p>
+      <w:pPr>
+        <w:rPr>
+          <w:lang w:val="en-US"/>
+        </w:rPr>
+      </w:pPr>
+      <w:r>
+        <w:rPr>
+          <w:lang w:val="en-US"/>
+        </w:rPr>
+        <w:t>A major part of our discussion revolved around implementing a real-time calendar system. The purpose of this feature is to display up-to-date availability for each doctor and prevent double bookings. Whenever an appointment is made or canceled, the system should immediately reflect the change. This functionality is important to maintain scheduling accuracy and improve user experience. We also planned to develop a secure patient portal where users can register, log in, and access their appointment details. Security was considered an essential requirement, so we agreed that authentication mechanisms would be implemented to protect patient data and ensure privacy.</w:t>
+      </w:r>
+    </w:p>
+    <w:p>
+      <w:pPr>
+        <w:rPr>
+          <w:lang w:val="en-US"/>
+        </w:rPr>
+      </w:pPr>
+      <w:r>
+        <w:rPr>
+          <w:lang w:val="en-US"/>
+        </w:rPr>
+        <w:t>In addition to defining features, we divided responsibilities among team members to ensure efficient workflow and accountability. Each member was assigned specific tasks such as frontend development, backend logic, database design, authentication handling, and testing. This clear distribution of work will help us manage time effectively and avoid confusion during development.</w:t>
+      </w:r>
+    </w:p>
+    <w:p>
+      <w:pPr>
+        <w:rPr>
+          <w:lang w:val="en-US"/>
+        </w:rPr>
+      </w:pPr>
+      <w:r>
+        <w:rPr>
+          <w:lang w:val="en-US"/>
+        </w:rPr>
+        <w:t>We also finalized the technology stack for the project. For the frontend, we chose HTML, CSS, and JavaScript to build a responsive and interactive user interface. For the backend, we decided to use Node.js because of its efficiency in handling asynchronous operations and real-time functionalities, which are necessary for features like appointment scheduling and calendar updates. For database management, we selected MySQL to store structured data such as user information, doctor profiles, and appointment records. To manage collaboration and version control, we agreed to use GitHub, allowing team members to work simultaneously while tracking changes and maintaining code organization.</w:t>
+      </w:r>
+    </w:p>
+    <w:p>
+      <w:pPr>
+        <w:rPr>
+          <w:lang w:val="en-US"/>
+        </w:rPr>
+      </w:pPr>
+      <w:r>
+        <w:rPr>
+          <w:lang w:val="en-US"/>
+        </w:rPr>
+        <w:t>Overall, Sprint 1 was focused on planning, technology selection, feature definition, and team coordination. By the end of this sprint, we established a clear roadmap for development and ensured that all members understood their roles and responsibilities moving forward.</w:t>
+      </w:r>
+    </w:p>
+    <w:p/>
     <w:p>
       <w:r>
         <w:t>The sketch below shows the registration page as wireframe for our system to visualise how the final product will look like.</w:t>
@@ -579,6 +663,10 @@
     </w:p>
     <w:p>
       <w:r>
+        <w:rPr>
+          <w:noProof/>
+        </w:rPr>
+        <w:lastRenderedPageBreak/>
         <w:drawing>
           <wp:inline distT="0" distB="0" distL="0" distR="0" wp14:anchorId="510DA8DB" wp14:editId="5D75DC23">
             <wp:extent cx="5731510" cy="3185795"/>
@@ -723,7 +811,6 @@
           <w:sz w:val="30"/>
           <w:szCs w:val="30"/>
         </w:rPr>
-        <w:lastRenderedPageBreak/>
         <w:t>SPRINT</w:t>
       </w:r>
       <w:r>
@@ -749,7 +836,11 @@
     </w:p>
     <w:p>
       <w:r>
-        <w:t>As you can see the prototype for the registration page is different from the wireframe sketch and that is because it looks more professional, as you can see there are 4 different text boxes that are asking for email, password, date of birth and phone number, the password has a view password symbol where users are able to see their password and check it, additionally the data of birth has a calendar so you can select what day, month and year you are born. Further, we’ve added a logo with the name of our system and a create account button</w:t>
+        <w:t xml:space="preserve">As you can see the prototype for the registration page is different from the wireframe sketch and that is because it looks more professional, as you can see there are 4 different text boxes that are asking for email, password, date of birth and phone number, the password has a view password symbol where users are able to see their password and check it, additionally the data of birth has a </w:t>
+      </w:r>
+      <w:r>
+        <w:lastRenderedPageBreak/>
+        <w:t>calendar so you can select what day, month and year you are born. Further, we’ve added a logo with the name of our system and a create account button</w:t>
       </w:r>
       <w:r>
         <w:t>.</w:t>
@@ -757,6 +848,9 @@
     </w:p>
     <w:p>
       <w:r>
+        <w:rPr>
+          <w:noProof/>
+        </w:rPr>
         <w:drawing>
           <wp:inline distT="0" distB="0" distL="0" distR="0" wp14:anchorId="140AE605" wp14:editId="01270977">
             <wp:extent cx="5645150" cy="2970802"/>
@@ -879,7 +973,6 @@
           <w:i/>
           <w:iCs/>
         </w:rPr>
-        <w:lastRenderedPageBreak/>
         <w:t xml:space="preserve">Prototype 2 </w:t>
       </w:r>
       <w:r>
@@ -960,6 +1053,7 @@
           <w:sz w:val="30"/>
           <w:szCs w:val="30"/>
         </w:rPr>
+        <w:lastRenderedPageBreak/>
         <w:t>REFERENCES</w:t>
       </w:r>
       <w:r>
@@ -1281,6 +1375,92 @@
     </w:lvl>
   </w:abstractNum>
   <w:abstractNum w:abstractNumId="2" w15:restartNumberingAfterBreak="0">
+    <w:nsid w:val="14B104F2"/>
+    <w:multiLevelType w:val="hybridMultilevel"/>
+    <w:tmpl w:val="EF9A8506"/>
+    <w:lvl w:ilvl="0" w:tplc="0409000F">
+      <w:start w:val="1"/>
+      <w:numFmt w:val="decimal"/>
+      <w:lvlText w:val="%1."/>
+      <w:lvlJc w:val="left"/>
+      <w:pPr>
+        <w:ind w:left="767" w:hanging="360"/>
+      </w:pPr>
+    </w:lvl>
+    <w:lvl w:ilvl="1" w:tplc="04090019" w:tentative="1">
+      <w:start w:val="1"/>
+      <w:numFmt w:val="lowerLetter"/>
+      <w:lvlText w:val="%2."/>
+      <w:lvlJc w:val="left"/>
+      <w:pPr>
+        <w:ind w:left="1487" w:hanging="360"/>
+      </w:pPr>
+    </w:lvl>
+    <w:lvl w:ilvl="2" w:tplc="0409001B" w:tentative="1">
+      <w:start w:val="1"/>
+      <w:numFmt w:val="lowerRoman"/>
+      <w:lvlText w:val="%3."/>
+      <w:lvlJc w:val="right"/>
+      <w:pPr>
+        <w:ind w:left="2207" w:hanging="180"/>
+      </w:pPr>
+    </w:lvl>
+    <w:lvl w:ilvl="3" w:tplc="0409000F" w:tentative="1">
+      <w:start w:val="1"/>
+      <w:numFmt w:val="decimal"/>
+      <w:lvlText w:val="%4."/>
+      <w:lvlJc w:val="left"/>
+      <w:pPr>
+        <w:ind w:left="2927" w:hanging="360"/>
+      </w:pPr>
+    </w:lvl>
+    <w:lvl w:ilvl="4" w:tplc="04090019" w:tentative="1">
+      <w:start w:val="1"/>
+      <w:numFmt w:val="lowerLetter"/>
+      <w:lvlText w:val="%5."/>
+      <w:lvlJc w:val="left"/>
+      <w:pPr>
+        <w:ind w:left="3647" w:hanging="360"/>
+      </w:pPr>
+    </w:lvl>
+    <w:lvl w:ilvl="5" w:tplc="0409001B" w:tentative="1">
+      <w:start w:val="1"/>
+      <w:numFmt w:val="lowerRoman"/>
+      <w:lvlText w:val="%6."/>
+      <w:lvlJc w:val="right"/>
+      <w:pPr>
+        <w:ind w:left="4367" w:hanging="180"/>
+      </w:pPr>
+    </w:lvl>
+    <w:lvl w:ilvl="6" w:tplc="0409000F" w:tentative="1">
+      <w:start w:val="1"/>
+      <w:numFmt w:val="decimal"/>
+      <w:lvlText w:val="%7."/>
+      <w:lvlJc w:val="left"/>
+      <w:pPr>
+        <w:ind w:left="5087" w:hanging="360"/>
+      </w:pPr>
+    </w:lvl>
+    <w:lvl w:ilvl="7" w:tplc="04090019" w:tentative="1">
+      <w:start w:val="1"/>
+      <w:numFmt w:val="lowerLetter"/>
+      <w:lvlText w:val="%8."/>
+      <w:lvlJc w:val="left"/>
+      <w:pPr>
+        <w:ind w:left="5807" w:hanging="360"/>
+      </w:pPr>
+    </w:lvl>
+    <w:lvl w:ilvl="8" w:tplc="0409001B" w:tentative="1">
+      <w:start w:val="1"/>
+      <w:numFmt w:val="lowerRoman"/>
+      <w:lvlText w:val="%9."/>
+      <w:lvlJc w:val="right"/>
+      <w:pPr>
+        <w:ind w:left="6527" w:hanging="180"/>
+      </w:pPr>
+    </w:lvl>
+  </w:abstractNum>
+  <w:abstractNum w:abstractNumId="3" w15:restartNumberingAfterBreak="0">
     <w:nsid w:val="157E35FB"/>
     <w:multiLevelType w:val="hybridMultilevel"/>
     <w:tmpl w:val="378662E2"/>
@@ -1393,7 +1573,7 @@
       </w:rPr>
     </w:lvl>
   </w:abstractNum>
-  <w:abstractNum w:abstractNumId="3" w15:restartNumberingAfterBreak="0">
+  <w:abstractNum w:abstractNumId="4" w15:restartNumberingAfterBreak="0">
     <w:nsid w:val="1FD02DE2"/>
     <w:multiLevelType w:val="hybridMultilevel"/>
     <w:tmpl w:val="828824B4"/>
@@ -1482,7 +1662,7 @@
       </w:pPr>
     </w:lvl>
   </w:abstractNum>
-  <w:abstractNum w:abstractNumId="4" w15:restartNumberingAfterBreak="0">
+  <w:abstractNum w:abstractNumId="5" w15:restartNumberingAfterBreak="0">
     <w:nsid w:val="20632E83"/>
     <w:multiLevelType w:val="hybridMultilevel"/>
     <w:tmpl w:val="AB7C1E06"/>
@@ -1572,7 +1752,7 @@
       </w:pPr>
     </w:lvl>
   </w:abstractNum>
-  <w:abstractNum w:abstractNumId="5" w15:restartNumberingAfterBreak="0">
+  <w:abstractNum w:abstractNumId="6" w15:restartNumberingAfterBreak="0">
     <w:nsid w:val="233E4D59"/>
     <w:multiLevelType w:val="hybridMultilevel"/>
     <w:tmpl w:val="0B2855CA"/>
@@ -1684,7 +1864,7 @@
       </w:rPr>
     </w:lvl>
   </w:abstractNum>
-  <w:abstractNum w:abstractNumId="6" w15:restartNumberingAfterBreak="0">
+  <w:abstractNum w:abstractNumId="7" w15:restartNumberingAfterBreak="0">
     <w:nsid w:val="276F0A93"/>
     <w:multiLevelType w:val="hybridMultilevel"/>
     <w:tmpl w:val="B4E414C4"/>
@@ -1796,7 +1976,7 @@
       </w:rPr>
     </w:lvl>
   </w:abstractNum>
-  <w:abstractNum w:abstractNumId="7" w15:restartNumberingAfterBreak="0">
+  <w:abstractNum w:abstractNumId="8" w15:restartNumberingAfterBreak="0">
     <w:nsid w:val="284F2760"/>
     <w:multiLevelType w:val="hybridMultilevel"/>
     <w:tmpl w:val="F9861D7C"/>
@@ -1908,7 +2088,7 @@
       </w:rPr>
     </w:lvl>
   </w:abstractNum>
-  <w:abstractNum w:abstractNumId="8" w15:restartNumberingAfterBreak="0">
+  <w:abstractNum w:abstractNumId="9" w15:restartNumberingAfterBreak="0">
     <w:nsid w:val="31140428"/>
     <w:multiLevelType w:val="hybridMultilevel"/>
     <w:tmpl w:val="D27088B4"/>
@@ -1997,7 +2177,7 @@
       </w:pPr>
     </w:lvl>
   </w:abstractNum>
-  <w:abstractNum w:abstractNumId="9" w15:restartNumberingAfterBreak="0">
+  <w:abstractNum w:abstractNumId="10" w15:restartNumberingAfterBreak="0">
     <w:nsid w:val="35C57AC8"/>
     <w:multiLevelType w:val="hybridMultilevel"/>
     <w:tmpl w:val="A5202662"/>
@@ -2086,7 +2266,7 @@
       </w:pPr>
     </w:lvl>
   </w:abstractNum>
-  <w:abstractNum w:abstractNumId="10" w15:restartNumberingAfterBreak="0">
+  <w:abstractNum w:abstractNumId="11" w15:restartNumberingAfterBreak="0">
     <w:nsid w:val="414B0C3E"/>
     <w:multiLevelType w:val="hybridMultilevel"/>
     <w:tmpl w:val="329AA942"/>
@@ -2198,7 +2378,7 @@
       </w:rPr>
     </w:lvl>
   </w:abstractNum>
-  <w:abstractNum w:abstractNumId="11" w15:restartNumberingAfterBreak="0">
+  <w:abstractNum w:abstractNumId="12" w15:restartNumberingAfterBreak="0">
     <w:nsid w:val="42BC6810"/>
     <w:multiLevelType w:val="hybridMultilevel"/>
     <w:tmpl w:val="066EEC78"/>
@@ -2310,7 +2490,7 @@
       </w:rPr>
     </w:lvl>
   </w:abstractNum>
-  <w:abstractNum w:abstractNumId="12" w15:restartNumberingAfterBreak="0">
+  <w:abstractNum w:abstractNumId="13" w15:restartNumberingAfterBreak="0">
     <w:nsid w:val="498943F7"/>
     <w:multiLevelType w:val="hybridMultilevel"/>
     <w:tmpl w:val="7840C128"/>
@@ -2402,7 +2582,7 @@
       </w:pPr>
     </w:lvl>
   </w:abstractNum>
-  <w:abstractNum w:abstractNumId="13" w15:restartNumberingAfterBreak="0">
+  <w:abstractNum w:abstractNumId="14" w15:restartNumberingAfterBreak="0">
     <w:nsid w:val="4D4646D9"/>
     <w:multiLevelType w:val="hybridMultilevel"/>
     <w:tmpl w:val="2294C8A8"/>
@@ -2514,7 +2694,7 @@
       </w:rPr>
     </w:lvl>
   </w:abstractNum>
-  <w:abstractNum w:abstractNumId="14" w15:restartNumberingAfterBreak="0">
+  <w:abstractNum w:abstractNumId="15" w15:restartNumberingAfterBreak="0">
     <w:nsid w:val="4DB43EF7"/>
     <w:multiLevelType w:val="hybridMultilevel"/>
     <w:tmpl w:val="B5B6B496"/>
@@ -2626,7 +2806,7 @@
       </w:rPr>
     </w:lvl>
   </w:abstractNum>
-  <w:abstractNum w:abstractNumId="15" w15:restartNumberingAfterBreak="0">
+  <w:abstractNum w:abstractNumId="16" w15:restartNumberingAfterBreak="0">
     <w:nsid w:val="52AD7C01"/>
     <w:multiLevelType w:val="hybridMultilevel"/>
     <w:tmpl w:val="26DC49EC"/>
@@ -2738,7 +2918,7 @@
       </w:rPr>
     </w:lvl>
   </w:abstractNum>
-  <w:abstractNum w:abstractNumId="16" w15:restartNumberingAfterBreak="0">
+  <w:abstractNum w:abstractNumId="17" w15:restartNumberingAfterBreak="0">
     <w:nsid w:val="5639143F"/>
     <w:multiLevelType w:val="hybridMultilevel"/>
     <w:tmpl w:val="A57612E4"/>
@@ -2850,7 +3030,7 @@
       </w:rPr>
     </w:lvl>
   </w:abstractNum>
-  <w:abstractNum w:abstractNumId="17" w15:restartNumberingAfterBreak="0">
+  <w:abstractNum w:abstractNumId="18" w15:restartNumberingAfterBreak="0">
     <w:nsid w:val="57DD0EA0"/>
     <w:multiLevelType w:val="hybridMultilevel"/>
     <w:tmpl w:val="3C4EECC8"/>
@@ -2962,7 +3142,7 @@
       </w:rPr>
     </w:lvl>
   </w:abstractNum>
-  <w:abstractNum w:abstractNumId="18" w15:restartNumberingAfterBreak="0">
+  <w:abstractNum w:abstractNumId="19" w15:restartNumberingAfterBreak="0">
     <w:nsid w:val="5ABC2B1A"/>
     <w:multiLevelType w:val="hybridMultilevel"/>
     <w:tmpl w:val="6C2C37AA"/>
@@ -3075,7 +3255,7 @@
       </w:rPr>
     </w:lvl>
   </w:abstractNum>
-  <w:abstractNum w:abstractNumId="19" w15:restartNumberingAfterBreak="0">
+  <w:abstractNum w:abstractNumId="20" w15:restartNumberingAfterBreak="0">
     <w:nsid w:val="5B8F3918"/>
     <w:multiLevelType w:val="hybridMultilevel"/>
     <w:tmpl w:val="7700DEEC"/>
@@ -3165,7 +3345,7 @@
       </w:pPr>
     </w:lvl>
   </w:abstractNum>
-  <w:abstractNum w:abstractNumId="20" w15:restartNumberingAfterBreak="0">
+  <w:abstractNum w:abstractNumId="21" w15:restartNumberingAfterBreak="0">
     <w:nsid w:val="63C24ED5"/>
     <w:multiLevelType w:val="hybridMultilevel"/>
     <w:tmpl w:val="7C9AA8EC"/>
@@ -3277,7 +3457,7 @@
       </w:rPr>
     </w:lvl>
   </w:abstractNum>
-  <w:abstractNum w:abstractNumId="21" w15:restartNumberingAfterBreak="0">
+  <w:abstractNum w:abstractNumId="22" w15:restartNumberingAfterBreak="0">
     <w:nsid w:val="64FB3FD3"/>
     <w:multiLevelType w:val="hybridMultilevel"/>
     <w:tmpl w:val="514C6A78"/>
@@ -3389,7 +3569,7 @@
       </w:rPr>
     </w:lvl>
   </w:abstractNum>
-  <w:abstractNum w:abstractNumId="22" w15:restartNumberingAfterBreak="0">
+  <w:abstractNum w:abstractNumId="23" w15:restartNumberingAfterBreak="0">
     <w:nsid w:val="666F7D0C"/>
     <w:multiLevelType w:val="hybridMultilevel"/>
     <w:tmpl w:val="10307882"/>
@@ -3478,7 +3658,7 @@
       </w:pPr>
     </w:lvl>
   </w:abstractNum>
-  <w:abstractNum w:abstractNumId="23" w15:restartNumberingAfterBreak="0">
+  <w:abstractNum w:abstractNumId="24" w15:restartNumberingAfterBreak="0">
     <w:nsid w:val="75E0664C"/>
     <w:multiLevelType w:val="hybridMultilevel"/>
     <w:tmpl w:val="798C63F0"/>
@@ -3590,7 +3770,7 @@
       </w:rPr>
     </w:lvl>
   </w:abstractNum>
-  <w:abstractNum w:abstractNumId="24" w15:restartNumberingAfterBreak="0">
+  <w:abstractNum w:abstractNumId="25" w15:restartNumberingAfterBreak="0">
     <w:nsid w:val="760037D4"/>
     <w:multiLevelType w:val="hybridMultilevel"/>
     <w:tmpl w:val="A19EC902"/>
@@ -3703,7 +3883,7 @@
       </w:rPr>
     </w:lvl>
   </w:abstractNum>
-  <w:abstractNum w:abstractNumId="25" w15:restartNumberingAfterBreak="0">
+  <w:abstractNum w:abstractNumId="26" w15:restartNumberingAfterBreak="0">
     <w:nsid w:val="7E1409E7"/>
     <w:multiLevelType w:val="hybridMultilevel"/>
     <w:tmpl w:val="D0EEE388"/>
@@ -3793,82 +3973,85 @@
     </w:lvl>
   </w:abstractNum>
   <w:num w:numId="1" w16cid:durableId="1126893892">
-    <w:abstractNumId w:val="10"/>
+    <w:abstractNumId w:val="11"/>
   </w:num>
   <w:num w:numId="2" w16cid:durableId="1775860873">
-    <w:abstractNumId w:val="11"/>
+    <w:abstractNumId w:val="12"/>
   </w:num>
   <w:num w:numId="3" w16cid:durableId="2077849411">
+    <w:abstractNumId w:val="8"/>
+  </w:num>
+  <w:num w:numId="4" w16cid:durableId="2008750572">
+    <w:abstractNumId w:val="6"/>
+  </w:num>
+  <w:num w:numId="5" w16cid:durableId="1951233629">
+    <w:abstractNumId w:val="21"/>
+  </w:num>
+  <w:num w:numId="6" w16cid:durableId="1392382496">
+    <w:abstractNumId w:val="17"/>
+  </w:num>
+  <w:num w:numId="7" w16cid:durableId="308100552">
     <w:abstractNumId w:val="7"/>
   </w:num>
-  <w:num w:numId="4" w16cid:durableId="2008750572">
-    <w:abstractNumId w:val="5"/>
+  <w:num w:numId="8" w16cid:durableId="1955746214">
+    <w:abstractNumId w:val="3"/>
   </w:num>
-  <w:num w:numId="5" w16cid:durableId="1951233629">
-    <w:abstractNumId w:val="20"/>
+  <w:num w:numId="9" w16cid:durableId="992879236">
+    <w:abstractNumId w:val="13"/>
   </w:num>
-  <w:num w:numId="6" w16cid:durableId="1392382496">
+  <w:num w:numId="10" w16cid:durableId="1988046079">
+    <w:abstractNumId w:val="25"/>
+  </w:num>
+  <w:num w:numId="11" w16cid:durableId="1763060751">
+    <w:abstractNumId w:val="18"/>
+  </w:num>
+  <w:num w:numId="12" w16cid:durableId="613361763">
+    <w:abstractNumId w:val="15"/>
+  </w:num>
+  <w:num w:numId="13" w16cid:durableId="1532766479">
+    <w:abstractNumId w:val="14"/>
+  </w:num>
+  <w:num w:numId="14" w16cid:durableId="379331808">
     <w:abstractNumId w:val="16"/>
   </w:num>
-  <w:num w:numId="7" w16cid:durableId="308100552">
-    <w:abstractNumId w:val="6"/>
+  <w:num w:numId="15" w16cid:durableId="1262225420">
+    <w:abstractNumId w:val="19"/>
   </w:num>
-  <w:num w:numId="8" w16cid:durableId="1955746214">
-    <w:abstractNumId w:val="2"/>
-  </w:num>
-  <w:num w:numId="9" w16cid:durableId="992879236">
-    <w:abstractNumId w:val="12"/>
-  </w:num>
-  <w:num w:numId="10" w16cid:durableId="1988046079">
+  <w:num w:numId="16" w16cid:durableId="371927138">
     <w:abstractNumId w:val="24"/>
   </w:num>
-  <w:num w:numId="11" w16cid:durableId="1763060751">
-    <w:abstractNumId w:val="17"/>
-  </w:num>
-  <w:num w:numId="12" w16cid:durableId="613361763">
-    <w:abstractNumId w:val="14"/>
-  </w:num>
-  <w:num w:numId="13" w16cid:durableId="1532766479">
-    <w:abstractNumId w:val="13"/>
-  </w:num>
-  <w:num w:numId="14" w16cid:durableId="379331808">
-    <w:abstractNumId w:val="15"/>
-  </w:num>
-  <w:num w:numId="15" w16cid:durableId="1262225420">
-    <w:abstractNumId w:val="18"/>
-  </w:num>
-  <w:num w:numId="16" w16cid:durableId="371927138">
+  <w:num w:numId="17" w16cid:durableId="2081438510">
     <w:abstractNumId w:val="23"/>
   </w:num>
-  <w:num w:numId="17" w16cid:durableId="2081438510">
-    <w:abstractNumId w:val="22"/>
-  </w:num>
   <w:num w:numId="18" w16cid:durableId="2125150139">
-    <w:abstractNumId w:val="3"/>
+    <w:abstractNumId w:val="4"/>
   </w:num>
   <w:num w:numId="19" w16cid:durableId="845218120">
-    <w:abstractNumId w:val="25"/>
+    <w:abstractNumId w:val="26"/>
   </w:num>
   <w:num w:numId="20" w16cid:durableId="1942445174">
-    <w:abstractNumId w:val="8"/>
+    <w:abstractNumId w:val="9"/>
   </w:num>
   <w:num w:numId="21" w16cid:durableId="1334912251">
     <w:abstractNumId w:val="1"/>
   </w:num>
   <w:num w:numId="22" w16cid:durableId="1180463123">
-    <w:abstractNumId w:val="9"/>
+    <w:abstractNumId w:val="10"/>
   </w:num>
   <w:num w:numId="23" w16cid:durableId="1828785779">
     <w:abstractNumId w:val="0"/>
   </w:num>
   <w:num w:numId="24" w16cid:durableId="1608583688">
-    <w:abstractNumId w:val="21"/>
+    <w:abstractNumId w:val="22"/>
   </w:num>
   <w:num w:numId="25" w16cid:durableId="2076050523">
-    <w:abstractNumId w:val="4"/>
+    <w:abstractNumId w:val="5"/>
   </w:num>
   <w:num w:numId="26" w16cid:durableId="1706784356">
-    <w:abstractNumId w:val="19"/>
+    <w:abstractNumId w:val="20"/>
+  </w:num>
+  <w:num w:numId="27" w16cid:durableId="1110592053">
+    <w:abstractNumId w:val="2"/>
   </w:num>
 </w:numbering>
 </file>
@@ -4318,7 +4501,6 @@
   <w:style w:type="character" w:default="1" w:styleId="DefaultParagraphFont">
     <w:name w:val="Default Paragraph Font"/>
     <w:uiPriority w:val="1"/>
-    <w:semiHidden/>
     <w:unhideWhenUsed/>
   </w:style>
   <w:style w:type="table" w:default="1" w:styleId="TableNormal">
@@ -4622,7 +4804,7 @@
       </w:tcPr>
     </w:tblStylePr>
   </w:style>
-  <w:style w:type="table" w:styleId="ListTable6ColourfulAccent2">
+  <w:style w:type="table" w:styleId="ListTable6Colorful-Accent2">
     <w:name w:val="List Table 6 Colorful Accent 2"/>
     <w:basedOn w:val="TableNormal"/>
     <w:uiPriority w:val="51"/>

</xml_diff>

<commit_message>
Enhance project documentation with detailed descriptions of main page wireframe and prototypes, including user interface features and design improvements.
</commit_message>
<xml_diff>
--- a/Software Engineering Group Project.docx
+++ b/Software Engineering Group Project.docx
@@ -794,6 +794,103 @@
     </w:p>
     <w:p>
       <w:pPr>
+        <w:rPr>
+          <w:b/>
+          <w:bCs/>
+          <w:i/>
+          <w:iCs/>
+        </w:rPr>
+      </w:pPr>
+    </w:p>
+    <w:p>
+      <w:r>
+        <w:t xml:space="preserve">The main page wireframe is to access your personal portal and doctor </w:t>
+      </w:r>
+      <w:r>
+        <w:t>availability</w:t>
+      </w:r>
+      <w:r>
+        <w:t xml:space="preserve">. You can check the live calendar, book an appointments </w:t>
+      </w:r>
+      <w:r>
+        <w:t xml:space="preserve">and to check the records. </w:t>
+      </w:r>
+    </w:p>
+    <w:p>
+      <w:pPr>
+        <w:rPr>
+          <w:b/>
+          <w:bCs/>
+          <w:i/>
+          <w:iCs/>
+        </w:rPr>
+      </w:pPr>
+      <w:r>
+        <w:rPr>
+          <w:b/>
+          <w:bCs/>
+          <w:i/>
+          <w:iCs/>
+        </w:rPr>
+        <w:lastRenderedPageBreak/>
+        <w:drawing>
+          <wp:inline distT="0" distB="0" distL="0" distR="0" wp14:anchorId="76DFA2C4" wp14:editId="2A13B9F8">
+            <wp:extent cx="5731510" cy="3237865"/>
+            <wp:effectExtent l="0" t="0" r="2540" b="635"/>
+            <wp:docPr id="309152562" name="Picture 1"/>
+            <wp:cNvGraphicFramePr>
+              <a:graphicFrameLocks xmlns:a="http://schemas.openxmlformats.org/drawingml/2006/main" noChangeAspect="1"/>
+            </wp:cNvGraphicFramePr>
+            <a:graphic xmlns:a="http://schemas.openxmlformats.org/drawingml/2006/main">
+              <a:graphicData uri="http://schemas.openxmlformats.org/drawingml/2006/picture">
+                <pic:pic xmlns:pic="http://schemas.openxmlformats.org/drawingml/2006/picture">
+                  <pic:nvPicPr>
+                    <pic:cNvPr id="309152562" name=""/>
+                    <pic:cNvPicPr/>
+                  </pic:nvPicPr>
+                  <pic:blipFill>
+                    <a:blip r:embed="rId10"/>
+                    <a:stretch>
+                      <a:fillRect/>
+                    </a:stretch>
+                  </pic:blipFill>
+                  <pic:spPr>
+                    <a:xfrm>
+                      <a:off x="0" y="0"/>
+                      <a:ext cx="5731510" cy="3237865"/>
+                    </a:xfrm>
+                    <a:prstGeom prst="rect">
+                      <a:avLst/>
+                    </a:prstGeom>
+                  </pic:spPr>
+                </pic:pic>
+              </a:graphicData>
+            </a:graphic>
+          </wp:inline>
+        </w:drawing>
+      </w:r>
+    </w:p>
+    <w:p>
+      <w:pPr>
+        <w:rPr>
+          <w:b/>
+          <w:bCs/>
+          <w:i/>
+          <w:iCs/>
+        </w:rPr>
+      </w:pPr>
+      <w:r>
+        <w:rPr>
+          <w:b/>
+          <w:bCs/>
+          <w:i/>
+          <w:iCs/>
+        </w:rPr>
+        <w:t xml:space="preserve">Wireframe 3- Mian page </w:t>
+      </w:r>
+    </w:p>
+    <w:p>
+      <w:pPr>
         <w:pStyle w:val="Heading1"/>
         <w:rPr>
           <w:rFonts w:asciiTheme="minorHAnsi" w:hAnsiTheme="minorHAnsi" w:cstheme="minorHAnsi"/>
@@ -836,11 +933,7 @@
     </w:p>
     <w:p>
       <w:r>
-        <w:t xml:space="preserve">As you can see the prototype for the registration page is different from the wireframe sketch and that is because it looks more professional, as you can see there are 4 different text boxes that are asking for email, password, date of birth and phone number, the password has a view password symbol where users are able to see their password and check it, additionally the data of birth has a </w:t>
-      </w:r>
-      <w:r>
-        <w:lastRenderedPageBreak/>
-        <w:t>calendar so you can select what day, month and year you are born. Further, we’ve added a logo with the name of our system and a create account button</w:t>
+        <w:t>As you can see the prototype for the registration page is different from the wireframe sketch and that is because it looks more professional, as you can see there are 4 different text boxes that are asking for email, password, date of birth and phone number, the password has a view password symbol where users are able to see their password and check it, additionally the data of birth has a calendar so you can select what day, month and year you are born. Further, we’ve added a logo with the name of our system and a create account button</w:t>
       </w:r>
       <w:r>
         <w:t>.</w:t>
@@ -867,7 +960,7 @@
                     <pic:cNvPicPr/>
                   </pic:nvPicPr>
                   <pic:blipFill>
-                    <a:blip r:embed="rId10"/>
+                    <a:blip r:embed="rId11"/>
                     <a:stretch>
                       <a:fillRect/>
                     </a:stretch>
@@ -909,6 +1002,7 @@
     </w:p>
     <w:p>
       <w:r>
+        <w:lastRenderedPageBreak/>
         <w:t>As you can see this is the prototype for the login page that we’ve came up with after doing the wireframe sketch, as visible here we went more in detail as we have a logo, with the name of our system, there are different buttons for login and register, also we’ve implemented the Login button that allows users to enter the system, 2 text boxes for email and password and a view password symbol which allows the users to check their password is good.</w:t>
       </w:r>
     </w:p>
@@ -936,7 +1030,7 @@
                     <pic:cNvPicPr/>
                   </pic:nvPicPr>
                   <pic:blipFill>
-                    <a:blip r:embed="rId11"/>
+                    <a:blip r:embed="rId12"/>
                     <a:stretch>
                       <a:fillRect/>
                     </a:stretch>
@@ -995,6 +1089,131 @@
       </w:r>
     </w:p>
     <w:p>
+      <w:r>
+        <w:t xml:space="preserve">This </w:t>
+      </w:r>
+      <w:r>
+        <w:t xml:space="preserve">prototype shows the main dashboard interface, </w:t>
+      </w:r>
+      <w:r>
+        <w:t>it</w:t>
+      </w:r>
+      <w:r>
+        <w:t xml:space="preserve"> features a clean top navigation with a menu icon, a </w:t>
+      </w:r>
+      <w:r>
+        <w:t xml:space="preserve">cantered profile indicator, and a logout </w:t>
+      </w:r>
+      <w:r>
+        <w:t>button</w:t>
+      </w:r>
+      <w:r>
+        <w:t xml:space="preserve"> </w:t>
+      </w:r>
+      <w:r>
+        <w:t xml:space="preserve">for secure access control. The main </w:t>
+      </w:r>
+      <w:r>
+        <w:t xml:space="preserve">section is </w:t>
+      </w:r>
+      <w:r>
+        <w:t>the</w:t>
+      </w:r>
+      <w:r>
+        <w:t xml:space="preserve"> main section is designed using a card-based layout with three primary options: Calendar, Appointments, and Records. Each card represents a core feature and allows users to easily navigate to different functionalities. The design focuses on simplicity, clarity, and user-friendly interaction, ensuring smooth navigation and an organized structure.</w:t>
+      </w:r>
+      <w:r>
+        <w:t xml:space="preserve"> The difference between the prototype and the wireframe is, I have changed colours, made it more professionally, changed the shapes of the cards</w:t>
+      </w:r>
+      <w:r>
+        <w:t xml:space="preserve">, instead of logo in the corner, I have logout. And instead of writing the main page in the centre, I have uploaded the logo of the </w:t>
+      </w:r>
+      <w:proofErr w:type="spellStart"/>
+      <w:r>
+        <w:t>ho</w:t>
+      </w:r>
+      <w:r>
+        <w:t>spi</w:t>
+      </w:r>
+      <w:proofErr w:type="spellEnd"/>
+      <w:r>
+        <w:t xml:space="preserve"> FY. </w:t>
+      </w:r>
+    </w:p>
+    <w:p>
+      <w:pPr>
+        <w:rPr>
+          <w:b/>
+          <w:bCs/>
+          <w:i/>
+          <w:iCs/>
+        </w:rPr>
+      </w:pPr>
+      <w:r>
+        <w:rPr>
+          <w:b/>
+          <w:bCs/>
+          <w:i/>
+          <w:iCs/>
+        </w:rPr>
+        <w:drawing>
+          <wp:inline distT="0" distB="0" distL="0" distR="0" wp14:anchorId="05897F2A" wp14:editId="12D3F811">
+            <wp:extent cx="5731510" cy="2721610"/>
+            <wp:effectExtent l="0" t="0" r="2540" b="2540"/>
+            <wp:docPr id="499482334" name="Picture 1"/>
+            <wp:cNvGraphicFramePr>
+              <a:graphicFrameLocks xmlns:a="http://schemas.openxmlformats.org/drawingml/2006/main" noChangeAspect="1"/>
+            </wp:cNvGraphicFramePr>
+            <a:graphic xmlns:a="http://schemas.openxmlformats.org/drawingml/2006/main">
+              <a:graphicData uri="http://schemas.openxmlformats.org/drawingml/2006/picture">
+                <pic:pic xmlns:pic="http://schemas.openxmlformats.org/drawingml/2006/picture">
+                  <pic:nvPicPr>
+                    <pic:cNvPr id="499482334" name=""/>
+                    <pic:cNvPicPr/>
+                  </pic:nvPicPr>
+                  <pic:blipFill>
+                    <a:blip r:embed="rId13"/>
+                    <a:stretch>
+                      <a:fillRect/>
+                    </a:stretch>
+                  </pic:blipFill>
+                  <pic:spPr>
+                    <a:xfrm>
+                      <a:off x="0" y="0"/>
+                      <a:ext cx="5731510" cy="2721610"/>
+                    </a:xfrm>
+                    <a:prstGeom prst="rect">
+                      <a:avLst/>
+                    </a:prstGeom>
+                  </pic:spPr>
+                </pic:pic>
+              </a:graphicData>
+            </a:graphic>
+          </wp:inline>
+        </w:drawing>
+      </w:r>
+    </w:p>
+    <w:p>
+      <w:pPr>
+        <w:rPr>
+          <w:b/>
+          <w:bCs/>
+          <w:i/>
+          <w:iCs/>
+        </w:rPr>
+      </w:pPr>
+      <w:r>
+        <w:rPr>
+          <w:b/>
+          <w:bCs/>
+          <w:i/>
+          <w:iCs/>
+        </w:rPr>
+        <w:lastRenderedPageBreak/>
+        <w:t xml:space="preserve">Prototype 3- Main page </w:t>
+      </w:r>
+    </w:p>
+    <w:p>
       <w:pPr>
         <w:pStyle w:val="Heading1"/>
         <w:rPr>
@@ -1053,7 +1272,6 @@
           <w:sz w:val="30"/>
           <w:szCs w:val="30"/>
         </w:rPr>
-        <w:lastRenderedPageBreak/>
         <w:t>REFERENCES</w:t>
       </w:r>
       <w:r>
@@ -1069,8 +1287,8 @@
     </w:p>
     <w:p/>
     <w:sectPr>
-      <w:headerReference w:type="default" r:id="rId12"/>
-      <w:footerReference w:type="default" r:id="rId13"/>
+      <w:headerReference w:type="default" r:id="rId14"/>
+      <w:footerReference w:type="default" r:id="rId15"/>
       <w:pgSz w:w="11906" w:h="16838"/>
       <w:pgMar w:top="1440" w:right="1440" w:bottom="1440" w:left="1440" w:header="708" w:footer="708" w:gutter="0"/>
       <w:pgNumType w:start="0"/>

</xml_diff>

<commit_message>
Update project documentation with detailed product backlog and user stories for SPRINT 2
</commit_message>
<xml_diff>
--- a/Software Engineering Group Project.docx
+++ b/Software Engineering Group Project.docx
@@ -75,7 +75,7 @@
           <w:r>
             <w:fldChar w:fldCharType="separate"/>
           </w:r>
-          <w:hyperlink w:anchor="_Toc221889245" w:history="1">
+          <w:hyperlink w:anchor="_Toc223612986" w:history="1">
             <w:r>
               <w:rPr>
                 <w:rStyle w:val="Hyperlink"/>
@@ -103,7 +103,7 @@
                 <w:noProof/>
                 <w:webHidden/>
               </w:rPr>
-              <w:instrText xml:space="preserve"> PAGEREF _Toc221889245 \h </w:instrText>
+              <w:instrText xml:space="preserve"> PAGEREF _Toc223612986 \h </w:instrText>
             </w:r>
             <w:r>
               <w:rPr>
@@ -124,6 +124,80 @@
                 <w:webHidden/>
               </w:rPr>
               <w:t>1</w:t>
+            </w:r>
+            <w:r>
+              <w:rPr>
+                <w:noProof/>
+                <w:webHidden/>
+              </w:rPr>
+              <w:fldChar w:fldCharType="end"/>
+            </w:r>
+          </w:hyperlink>
+        </w:p>
+        <w:p>
+          <w:pPr>
+            <w:pStyle w:val="TOC2"/>
+            <w:tabs>
+              <w:tab w:val="right" w:leader="dot" w:pos="9016"/>
+            </w:tabs>
+            <w:rPr>
+              <w:rFonts w:eastAsiaTheme="minorEastAsia"/>
+              <w:noProof/>
+              <w:kern w:val="2"/>
+              <w:sz w:val="24"/>
+              <w:szCs w:val="24"/>
+              <w:lang w:eastAsia="en-GB"/>
+              <w14:ligatures w14:val="standardContextual"/>
+            </w:rPr>
+          </w:pPr>
+          <w:hyperlink w:anchor="_Toc223612987" w:history="1">
+            <w:r>
+              <w:rPr>
+                <w:rStyle w:val="Hyperlink"/>
+                <w:noProof/>
+              </w:rPr>
+              <w:t>Product Backlog</w:t>
+            </w:r>
+            <w:r>
+              <w:rPr>
+                <w:noProof/>
+                <w:webHidden/>
+              </w:rPr>
+              <w:tab/>
+            </w:r>
+            <w:r>
+              <w:rPr>
+                <w:noProof/>
+                <w:webHidden/>
+              </w:rPr>
+              <w:fldChar w:fldCharType="begin"/>
+            </w:r>
+            <w:r>
+              <w:rPr>
+                <w:noProof/>
+                <w:webHidden/>
+              </w:rPr>
+              <w:instrText xml:space="preserve"> PAGEREF _Toc223612987 \h </w:instrText>
+            </w:r>
+            <w:r>
+              <w:rPr>
+                <w:noProof/>
+                <w:webHidden/>
+              </w:rPr>
+            </w:r>
+            <w:r>
+              <w:rPr>
+                <w:noProof/>
+                <w:webHidden/>
+              </w:rPr>
+              <w:fldChar w:fldCharType="separate"/>
+            </w:r>
+            <w:r>
+              <w:rPr>
+                <w:noProof/>
+                <w:webHidden/>
+              </w:rPr>
+              <w:t>3</w:t>
             </w:r>
             <w:r>
               <w:rPr>
@@ -147,7 +221,7 @@
               <w14:ligatures w14:val="standardContextual"/>
             </w:rPr>
           </w:pPr>
-          <w:hyperlink w:anchor="_Toc221889246" w:history="1">
+          <w:hyperlink w:anchor="_Toc223612988" w:history="1">
             <w:r>
               <w:rPr>
                 <w:rStyle w:val="Hyperlink"/>
@@ -175,7 +249,7 @@
                 <w:noProof/>
                 <w:webHidden/>
               </w:rPr>
-              <w:instrText xml:space="preserve"> PAGEREF _Toc221889246 \h </w:instrText>
+              <w:instrText xml:space="preserve"> PAGEREF _Toc223612988 \h </w:instrText>
             </w:r>
             <w:r>
               <w:rPr>
@@ -195,7 +269,81 @@
                 <w:noProof/>
                 <w:webHidden/>
               </w:rPr>
-              <w:t>1</w:t>
+              <w:t>3</w:t>
+            </w:r>
+            <w:r>
+              <w:rPr>
+                <w:noProof/>
+                <w:webHidden/>
+              </w:rPr>
+              <w:fldChar w:fldCharType="end"/>
+            </w:r>
+          </w:hyperlink>
+        </w:p>
+        <w:p>
+          <w:pPr>
+            <w:pStyle w:val="TOC2"/>
+            <w:tabs>
+              <w:tab w:val="right" w:leader="dot" w:pos="9016"/>
+            </w:tabs>
+            <w:rPr>
+              <w:rFonts w:eastAsiaTheme="minorEastAsia"/>
+              <w:noProof/>
+              <w:kern w:val="2"/>
+              <w:sz w:val="24"/>
+              <w:szCs w:val="24"/>
+              <w:lang w:eastAsia="en-GB"/>
+              <w14:ligatures w14:val="standardContextual"/>
+            </w:rPr>
+          </w:pPr>
+          <w:hyperlink w:anchor="_Toc223612989" w:history="1">
+            <w:r>
+              <w:rPr>
+                <w:rStyle w:val="Hyperlink"/>
+                <w:noProof/>
+              </w:rPr>
+              <w:t>Sprint 2 Backlog:</w:t>
+            </w:r>
+            <w:r>
+              <w:rPr>
+                <w:noProof/>
+                <w:webHidden/>
+              </w:rPr>
+              <w:tab/>
+            </w:r>
+            <w:r>
+              <w:rPr>
+                <w:noProof/>
+                <w:webHidden/>
+              </w:rPr>
+              <w:fldChar w:fldCharType="begin"/>
+            </w:r>
+            <w:r>
+              <w:rPr>
+                <w:noProof/>
+                <w:webHidden/>
+              </w:rPr>
+              <w:instrText xml:space="preserve"> PAGEREF _Toc223612989 \h </w:instrText>
+            </w:r>
+            <w:r>
+              <w:rPr>
+                <w:noProof/>
+                <w:webHidden/>
+              </w:rPr>
+            </w:r>
+            <w:r>
+              <w:rPr>
+                <w:noProof/>
+                <w:webHidden/>
+              </w:rPr>
+              <w:fldChar w:fldCharType="separate"/>
+            </w:r>
+            <w:r>
+              <w:rPr>
+                <w:noProof/>
+                <w:webHidden/>
+              </w:rPr>
+              <w:t>4</w:t>
             </w:r>
             <w:r>
               <w:rPr>
@@ -219,7 +367,7 @@
               <w14:ligatures w14:val="standardContextual"/>
             </w:rPr>
           </w:pPr>
-          <w:hyperlink w:anchor="_Toc221889247" w:history="1">
+          <w:hyperlink w:anchor="_Toc223612990" w:history="1">
             <w:r>
               <w:rPr>
                 <w:rStyle w:val="Hyperlink"/>
@@ -247,7 +395,7 @@
                 <w:noProof/>
                 <w:webHidden/>
               </w:rPr>
-              <w:instrText xml:space="preserve"> PAGEREF _Toc221889247 \h </w:instrText>
+              <w:instrText xml:space="preserve"> PAGEREF _Toc223612990 \h </w:instrText>
             </w:r>
             <w:r>
               <w:rPr>
@@ -267,7 +415,7 @@
                 <w:noProof/>
                 <w:webHidden/>
               </w:rPr>
-              <w:t>1</w:t>
+              <w:t>6</w:t>
             </w:r>
             <w:r>
               <w:rPr>
@@ -291,7 +439,7 @@
               <w14:ligatures w14:val="standardContextual"/>
             </w:rPr>
           </w:pPr>
-          <w:hyperlink w:anchor="_Toc221889248" w:history="1">
+          <w:hyperlink w:anchor="_Toc223612991" w:history="1">
             <w:r>
               <w:rPr>
                 <w:rStyle w:val="Hyperlink"/>
@@ -319,7 +467,7 @@
                 <w:noProof/>
                 <w:webHidden/>
               </w:rPr>
-              <w:instrText xml:space="preserve"> PAGEREF _Toc221889248 \h </w:instrText>
+              <w:instrText xml:space="preserve"> PAGEREF _Toc223612991 \h </w:instrText>
             </w:r>
             <w:r>
               <w:rPr>
@@ -339,7 +487,7 @@
                 <w:noProof/>
                 <w:webHidden/>
               </w:rPr>
-              <w:t>1</w:t>
+              <w:t>6</w:t>
             </w:r>
             <w:r>
               <w:rPr>
@@ -541,7 +689,7 @@
           <w:szCs w:val="30"/>
         </w:rPr>
       </w:pPr>
-      <w:bookmarkStart w:id="0" w:name="_Toc221889245"/>
+      <w:bookmarkStart w:id="0" w:name="_Toc223612986"/>
       <w:r>
         <w:rPr>
           <w:rFonts w:asciiTheme="minorHAnsi" w:hAnsiTheme="minorHAnsi" w:cstheme="minorHAnsi"/>
@@ -549,7 +697,6 @@
           <w:sz w:val="30"/>
           <w:szCs w:val="30"/>
         </w:rPr>
-        <w:lastRenderedPageBreak/>
         <w:t>SPRINT</w:t>
       </w:r>
       <w:r>
@@ -831,6 +978,7 @@
           <w:bCs/>
           <w:i/>
           <w:iCs/>
+          <w:noProof/>
         </w:rPr>
         <w:lastRenderedPageBreak/>
         <w:drawing>
@@ -886,9 +1034,727 @@
           <w:i/>
           <w:iCs/>
         </w:rPr>
-        <w:t xml:space="preserve">Wireframe 3- Mian page </w:t>
+        <w:t>Wireframe 3- Mian page</w:t>
       </w:r>
     </w:p>
+    <w:p>
+      <w:bookmarkStart w:id="1" w:name="_Toc223612987"/>
+      <w:r>
+        <w:rPr>
+          <w:rStyle w:val="Heading2Char"/>
+        </w:rPr>
+        <w:t>Product B</w:t>
+      </w:r>
+      <w:r>
+        <w:rPr>
+          <w:rStyle w:val="Heading2Char"/>
+        </w:rPr>
+        <w:t>acklog</w:t>
+      </w:r>
+      <w:bookmarkEnd w:id="1"/>
+      <w:r>
+        <w:t>:</w:t>
+      </w:r>
+    </w:p>
+    <w:tbl>
+      <w:tblPr>
+        <w:tblStyle w:val="TableGrid"/>
+        <w:tblW w:w="0" w:type="auto"/>
+        <w:tblLook w:val="04A0" w:firstRow="1" w:lastRow="0" w:firstColumn="1" w:lastColumn="0" w:noHBand="0" w:noVBand="1"/>
+      </w:tblPr>
+      <w:tblGrid>
+        <w:gridCol w:w="3004"/>
+        <w:gridCol w:w="3006"/>
+        <w:gridCol w:w="3006"/>
+      </w:tblGrid>
+      <w:tr>
+        <w:tc>
+          <w:tcPr>
+            <w:tcW w:w="3004" w:type="dxa"/>
+          </w:tcPr>
+          <w:p>
+            <w:pPr>
+              <w:jc w:val="center"/>
+              <w:rPr>
+                <w:b/>
+                <w:bCs/>
+              </w:rPr>
+            </w:pPr>
+            <w:r>
+              <w:rPr>
+                <w:b/>
+                <w:bCs/>
+              </w:rPr>
+              <w:t>Number</w:t>
+            </w:r>
+          </w:p>
+        </w:tc>
+        <w:tc>
+          <w:tcPr>
+            <w:tcW w:w="3006" w:type="dxa"/>
+          </w:tcPr>
+          <w:p>
+            <w:pPr>
+              <w:jc w:val="center"/>
+              <w:rPr>
+                <w:b/>
+                <w:bCs/>
+              </w:rPr>
+            </w:pPr>
+            <w:r>
+              <w:rPr>
+                <w:b/>
+                <w:bCs/>
+              </w:rPr>
+              <w:t>User Stories</w:t>
+            </w:r>
+          </w:p>
+        </w:tc>
+        <w:tc>
+          <w:tcPr>
+            <w:tcW w:w="3006" w:type="dxa"/>
+          </w:tcPr>
+          <w:p>
+            <w:pPr>
+              <w:jc w:val="center"/>
+              <w:rPr>
+                <w:b/>
+                <w:bCs/>
+              </w:rPr>
+            </w:pPr>
+            <w:r>
+              <w:rPr>
+                <w:b/>
+                <w:bCs/>
+              </w:rPr>
+              <w:t>Estimate</w:t>
+            </w:r>
+          </w:p>
+        </w:tc>
+      </w:tr>
+      <w:tr>
+        <w:tc>
+          <w:tcPr>
+            <w:tcW w:w="3004" w:type="dxa"/>
+          </w:tcPr>
+          <w:p>
+            <w:pPr>
+              <w:pStyle w:val="ListParagraph"/>
+              <w:numPr>
+                <w:ilvl w:val="0"/>
+                <w:numId w:val="32"/>
+              </w:numPr>
+            </w:pPr>
+            <w:r>
+              <w:t>Register / Log-in</w:t>
+            </w:r>
+          </w:p>
+        </w:tc>
+        <w:tc>
+          <w:tcPr>
+            <w:tcW w:w="3006" w:type="dxa"/>
+          </w:tcPr>
+          <w:p>
+            <w:pPr>
+              <w:jc w:val="center"/>
+            </w:pPr>
+            <w:r>
+              <w:t>As a patient user of the medical system, I want to have the ability to create an account and log-in so that I can access my personal details safe and securely.</w:t>
+            </w:r>
+          </w:p>
+        </w:tc>
+        <w:tc>
+          <w:tcPr>
+            <w:tcW w:w="3006" w:type="dxa"/>
+          </w:tcPr>
+          <w:p>
+            <w:pPr>
+              <w:jc w:val="center"/>
+            </w:pPr>
+            <w:r>
+              <w:t>40</w:t>
+            </w:r>
+          </w:p>
+        </w:tc>
+      </w:tr>
+      <w:tr>
+        <w:tc>
+          <w:tcPr>
+            <w:tcW w:w="3004" w:type="dxa"/>
+          </w:tcPr>
+          <w:p>
+            <w:pPr>
+              <w:pStyle w:val="ListParagraph"/>
+              <w:numPr>
+                <w:ilvl w:val="0"/>
+                <w:numId w:val="32"/>
+              </w:numPr>
+            </w:pPr>
+            <w:r>
+              <w:t xml:space="preserve"> Logout</w:t>
+            </w:r>
+          </w:p>
+        </w:tc>
+        <w:tc>
+          <w:tcPr>
+            <w:tcW w:w="3006" w:type="dxa"/>
+          </w:tcPr>
+          <w:p>
+            <w:pPr>
+              <w:jc w:val="center"/>
+            </w:pPr>
+            <w:r>
+              <w:t>As a patient user of the medical system, I want to have the ability to logout so that my personal details remain secure after I'm done using the system.</w:t>
+            </w:r>
+          </w:p>
+          <w:p>
+            <w:pPr>
+              <w:jc w:val="center"/>
+            </w:pPr>
+          </w:p>
+        </w:tc>
+        <w:tc>
+          <w:tcPr>
+            <w:tcW w:w="3006" w:type="dxa"/>
+          </w:tcPr>
+          <w:p>
+            <w:pPr>
+              <w:jc w:val="center"/>
+            </w:pPr>
+            <w:r>
+              <w:t>13</w:t>
+            </w:r>
+          </w:p>
+        </w:tc>
+      </w:tr>
+      <w:tr>
+        <w:tc>
+          <w:tcPr>
+            <w:tcW w:w="3004" w:type="dxa"/>
+          </w:tcPr>
+          <w:p>
+            <w:pPr>
+              <w:pStyle w:val="ListParagraph"/>
+              <w:numPr>
+                <w:ilvl w:val="0"/>
+                <w:numId w:val="32"/>
+              </w:numPr>
+            </w:pPr>
+            <w:r>
+              <w:t xml:space="preserve">Secure Personal </w:t>
+            </w:r>
+          </w:p>
+        </w:tc>
+        <w:tc>
+          <w:tcPr>
+            <w:tcW w:w="3006" w:type="dxa"/>
+          </w:tcPr>
+          <w:p>
+            <w:pPr>
+              <w:jc w:val="center"/>
+            </w:pPr>
+            <w:r>
+              <w:t xml:space="preserve">As a patient user of the medical </w:t>
+            </w:r>
+            <w:r>
+              <w:t>system,</w:t>
+            </w:r>
+            <w:r>
+              <w:t xml:space="preserve"> I want to have a secure personal portal where I can add all my details securely so that every time I log in and I need to book an appointment I can just edit a couple of details and have everything sorted.</w:t>
+            </w:r>
+          </w:p>
+        </w:tc>
+        <w:tc>
+          <w:tcPr>
+            <w:tcW w:w="3006" w:type="dxa"/>
+          </w:tcPr>
+          <w:p>
+            <w:pPr>
+              <w:jc w:val="center"/>
+            </w:pPr>
+            <w:r>
+              <w:t>40</w:t>
+            </w:r>
+          </w:p>
+          <w:p/>
+        </w:tc>
+      </w:tr>
+      <w:tr>
+        <w:tc>
+          <w:tcPr>
+            <w:tcW w:w="3004" w:type="dxa"/>
+          </w:tcPr>
+          <w:p>
+            <w:pPr>
+              <w:pStyle w:val="ListParagraph"/>
+              <w:numPr>
+                <w:ilvl w:val="0"/>
+                <w:numId w:val="32"/>
+              </w:numPr>
+              <w:jc w:val="center"/>
+            </w:pPr>
+            <w:r>
+              <w:t>View Doctor Availability Calendar</w:t>
+            </w:r>
+          </w:p>
+        </w:tc>
+        <w:tc>
+          <w:tcPr>
+            <w:tcW w:w="3006" w:type="dxa"/>
+          </w:tcPr>
+          <w:p>
+            <w:pPr>
+              <w:jc w:val="center"/>
+            </w:pPr>
+            <w:r>
+              <w:t>As a patient, I want to be able to view the doctor’s availability calendar so that I can see available appointment slots for the upcoming month.</w:t>
+            </w:r>
+          </w:p>
+        </w:tc>
+        <w:tc>
+          <w:tcPr>
+            <w:tcW w:w="3006" w:type="dxa"/>
+          </w:tcPr>
+          <w:p>
+            <w:pPr>
+              <w:jc w:val="center"/>
+            </w:pPr>
+            <w:r>
+              <w:t>20</w:t>
+            </w:r>
+          </w:p>
+        </w:tc>
+      </w:tr>
+      <w:tr>
+        <w:tc>
+          <w:tcPr>
+            <w:tcW w:w="3004" w:type="dxa"/>
+          </w:tcPr>
+          <w:p>
+            <w:pPr>
+              <w:pStyle w:val="ListParagraph"/>
+              <w:numPr>
+                <w:ilvl w:val="0"/>
+                <w:numId w:val="32"/>
+              </w:numPr>
+            </w:pPr>
+            <w:r>
+              <w:lastRenderedPageBreak/>
+              <w:t>Appointment Booking</w:t>
+            </w:r>
+          </w:p>
+        </w:tc>
+        <w:tc>
+          <w:tcPr>
+            <w:tcW w:w="3006" w:type="dxa"/>
+          </w:tcPr>
+          <w:p>
+            <w:pPr>
+              <w:jc w:val="center"/>
+            </w:pPr>
+            <w:r>
+              <w:t>As a patient, I want to book an appointment through the system so that I can see and book an available time slot on specific dates.</w:t>
+            </w:r>
+          </w:p>
+          <w:p>
+            <w:pPr>
+              <w:jc w:val="center"/>
+            </w:pPr>
+          </w:p>
+        </w:tc>
+        <w:tc>
+          <w:tcPr>
+            <w:tcW w:w="3006" w:type="dxa"/>
+          </w:tcPr>
+          <w:p>
+            <w:pPr>
+              <w:jc w:val="center"/>
+            </w:pPr>
+            <w:r>
+              <w:t>40</w:t>
+            </w:r>
+          </w:p>
+        </w:tc>
+      </w:tr>
+      <w:tr>
+        <w:tc>
+          <w:tcPr>
+            <w:tcW w:w="3004" w:type="dxa"/>
+          </w:tcPr>
+          <w:p>
+            <w:pPr>
+              <w:pStyle w:val="ListParagraph"/>
+              <w:numPr>
+                <w:ilvl w:val="0"/>
+                <w:numId w:val="32"/>
+              </w:numPr>
+              <w:jc w:val="center"/>
+            </w:pPr>
+            <w:r>
+              <w:t>Cancel Appointment</w:t>
+            </w:r>
+          </w:p>
+          <w:p/>
+        </w:tc>
+        <w:tc>
+          <w:tcPr>
+            <w:tcW w:w="3006" w:type="dxa"/>
+          </w:tcPr>
+          <w:p>
+            <w:pPr>
+              <w:jc w:val="center"/>
+            </w:pPr>
+            <w:r>
+              <w:t>As a patient</w:t>
+            </w:r>
+            <w:r>
+              <w:br/>
+              <w:t>I want to cancel an appointment</w:t>
+            </w:r>
+            <w:r>
+              <w:br/>
+              <w:t>So that I can free up a slot if I cannot attend</w:t>
+            </w:r>
+          </w:p>
+        </w:tc>
+        <w:tc>
+          <w:tcPr>
+            <w:tcW w:w="3006" w:type="dxa"/>
+          </w:tcPr>
+          <w:p>
+            <w:pPr>
+              <w:jc w:val="center"/>
+            </w:pPr>
+            <w:r>
+              <w:t>20</w:t>
+            </w:r>
+          </w:p>
+        </w:tc>
+      </w:tr>
+      <w:tr>
+        <w:tc>
+          <w:tcPr>
+            <w:tcW w:w="3004" w:type="dxa"/>
+          </w:tcPr>
+          <w:p>
+            <w:pPr>
+              <w:pStyle w:val="ListParagraph"/>
+              <w:numPr>
+                <w:ilvl w:val="0"/>
+                <w:numId w:val="32"/>
+              </w:numPr>
+            </w:pPr>
+            <w:r>
+              <w:t>Update Personal Details</w:t>
+            </w:r>
+          </w:p>
+        </w:tc>
+        <w:tc>
+          <w:tcPr>
+            <w:tcW w:w="3006" w:type="dxa"/>
+          </w:tcPr>
+          <w:p>
+            <w:pPr>
+              <w:jc w:val="center"/>
+            </w:pPr>
+            <w:r>
+              <w:t>As a patient</w:t>
+            </w:r>
+            <w:r>
+              <w:br/>
+              <w:t>I want to update my personal information</w:t>
+            </w:r>
+            <w:r>
+              <w:br/>
+              <w:t>So that my records remain accurate</w:t>
+            </w:r>
+          </w:p>
+        </w:tc>
+        <w:tc>
+          <w:tcPr>
+            <w:tcW w:w="3006" w:type="dxa"/>
+          </w:tcPr>
+          <w:p>
+            <w:pPr>
+              <w:jc w:val="center"/>
+            </w:pPr>
+            <w:r>
+              <w:t>40</w:t>
+            </w:r>
+          </w:p>
+        </w:tc>
+      </w:tr>
+      <w:tr>
+        <w:tc>
+          <w:tcPr>
+            <w:tcW w:w="3004" w:type="dxa"/>
+          </w:tcPr>
+          <w:p>
+            <w:pPr>
+              <w:pStyle w:val="ListParagraph"/>
+              <w:numPr>
+                <w:ilvl w:val="0"/>
+                <w:numId w:val="32"/>
+              </w:numPr>
+            </w:pPr>
+            <w:r>
+              <w:t>Password Reset Feature</w:t>
+            </w:r>
+          </w:p>
+        </w:tc>
+        <w:tc>
+          <w:tcPr>
+            <w:tcW w:w="3006" w:type="dxa"/>
+          </w:tcPr>
+          <w:p>
+            <w:pPr>
+              <w:jc w:val="center"/>
+            </w:pPr>
+            <w:r>
+              <w:t>As a patient</w:t>
+            </w:r>
+            <w:r>
+              <w:br/>
+              <w:t>I want to reset my password</w:t>
+            </w:r>
+            <w:r>
+              <w:br/>
+              <w:t>So that I can regain access if I forget it</w:t>
+            </w:r>
+          </w:p>
+        </w:tc>
+        <w:tc>
+          <w:tcPr>
+            <w:tcW w:w="3006" w:type="dxa"/>
+          </w:tcPr>
+          <w:p>
+            <w:pPr>
+              <w:jc w:val="center"/>
+            </w:pPr>
+            <w:r>
+              <w:t>2</w:t>
+            </w:r>
+          </w:p>
+        </w:tc>
+      </w:tr>
+      <w:tr>
+        <w:tc>
+          <w:tcPr>
+            <w:tcW w:w="3004" w:type="dxa"/>
+          </w:tcPr>
+          <w:p>
+            <w:pPr>
+              <w:pStyle w:val="ListParagraph"/>
+              <w:numPr>
+                <w:ilvl w:val="0"/>
+                <w:numId w:val="32"/>
+              </w:numPr>
+            </w:pPr>
+            <w:r>
+              <w:t>Email confirmation for Appointments</w:t>
+            </w:r>
+          </w:p>
+        </w:tc>
+        <w:tc>
+          <w:tcPr>
+            <w:tcW w:w="3006" w:type="dxa"/>
+          </w:tcPr>
+          <w:p>
+            <w:pPr>
+              <w:jc w:val="center"/>
+            </w:pPr>
+            <w:r>
+              <w:t>As a patient, I want to receive an email confirmation after booking an appointment so that I can verify my appointment details and plan my visit accordingly</w:t>
+            </w:r>
+          </w:p>
+        </w:tc>
+        <w:tc>
+          <w:tcPr>
+            <w:tcW w:w="3006" w:type="dxa"/>
+          </w:tcPr>
+          <w:p>
+            <w:pPr>
+              <w:jc w:val="center"/>
+            </w:pPr>
+            <w:r>
+              <w:t>3</w:t>
+            </w:r>
+          </w:p>
+        </w:tc>
+      </w:tr>
+      <w:tr>
+        <w:tc>
+          <w:tcPr>
+            <w:tcW w:w="3004" w:type="dxa"/>
+          </w:tcPr>
+          <w:p>
+            <w:pPr>
+              <w:pStyle w:val="ListParagraph"/>
+              <w:numPr>
+                <w:ilvl w:val="0"/>
+                <w:numId w:val="32"/>
+              </w:numPr>
+            </w:pPr>
+            <w:r>
+              <w:t>Admin Dashboard for doctors</w:t>
+            </w:r>
+          </w:p>
+        </w:tc>
+        <w:tc>
+          <w:tcPr>
+            <w:tcW w:w="3006" w:type="dxa"/>
+          </w:tcPr>
+          <w:p>
+            <w:pPr>
+              <w:jc w:val="center"/>
+            </w:pPr>
+            <w:r>
+              <w:t>As a doctor, I want to view and manage my appointments through an admin dashboard so that I can see what upcoming patients I need to consult.</w:t>
+            </w:r>
+            <w:r>
+              <w:br/>
+              <w:t>I need to be able to add, edit, or remove available time slots using a calendar interface.</w:t>
+            </w:r>
+          </w:p>
+        </w:tc>
+        <w:tc>
+          <w:tcPr>
+            <w:tcW w:w="3006" w:type="dxa"/>
+          </w:tcPr>
+          <w:p>
+            <w:pPr>
+              <w:jc w:val="center"/>
+            </w:pPr>
+            <w:r>
+              <w:t>20</w:t>
+            </w:r>
+          </w:p>
+        </w:tc>
+      </w:tr>
+      <w:tr>
+        <w:tc>
+          <w:tcPr>
+            <w:tcW w:w="3004" w:type="dxa"/>
+          </w:tcPr>
+          <w:p>
+            <w:pPr>
+              <w:pStyle w:val="ListParagraph"/>
+              <w:numPr>
+                <w:ilvl w:val="0"/>
+                <w:numId w:val="32"/>
+              </w:numPr>
+            </w:pPr>
+            <w:r>
+              <w:t>Appointment history</w:t>
+            </w:r>
+          </w:p>
+        </w:tc>
+        <w:tc>
+          <w:tcPr>
+            <w:tcW w:w="3006" w:type="dxa"/>
+          </w:tcPr>
+          <w:p>
+            <w:pPr>
+              <w:jc w:val="center"/>
+            </w:pPr>
+            <w:r>
+              <w:t>As a patient, I want to view my appointment history so that I can keep track of my past and upcoming visits</w:t>
+            </w:r>
+          </w:p>
+        </w:tc>
+        <w:tc>
+          <w:tcPr>
+            <w:tcW w:w="3006" w:type="dxa"/>
+          </w:tcPr>
+          <w:p>
+            <w:pPr>
+              <w:jc w:val="center"/>
+            </w:pPr>
+            <w:r>
+              <w:t>2</w:t>
+            </w:r>
+          </w:p>
+        </w:tc>
+      </w:tr>
+      <w:tr>
+        <w:tc>
+          <w:tcPr>
+            <w:tcW w:w="3004" w:type="dxa"/>
+          </w:tcPr>
+          <w:p>
+            <w:pPr>
+              <w:pStyle w:val="ListParagraph"/>
+              <w:numPr>
+                <w:ilvl w:val="0"/>
+                <w:numId w:val="32"/>
+              </w:numPr>
+            </w:pPr>
+            <w:r>
+              <w:t>Appointment reminder notification</w:t>
+            </w:r>
+          </w:p>
+        </w:tc>
+        <w:tc>
+          <w:tcPr>
+            <w:tcW w:w="3006" w:type="dxa"/>
+          </w:tcPr>
+          <w:p>
+            <w:pPr>
+              <w:jc w:val="center"/>
+            </w:pPr>
+            <w:r>
+              <w:t>As a patient, I want to receive an appointment reminder before my scheduled visit so that I do not forget my appointment</w:t>
+            </w:r>
+          </w:p>
+        </w:tc>
+        <w:tc>
+          <w:tcPr>
+            <w:tcW w:w="3006" w:type="dxa"/>
+          </w:tcPr>
+          <w:p>
+            <w:pPr>
+              <w:jc w:val="center"/>
+            </w:pPr>
+            <w:r>
+              <w:t>2</w:t>
+            </w:r>
+          </w:p>
+        </w:tc>
+      </w:tr>
+      <w:tr>
+        <w:tc>
+          <w:tcPr>
+            <w:tcW w:w="3004" w:type="dxa"/>
+          </w:tcPr>
+          <w:p>
+            <w:pPr>
+              <w:jc w:val="center"/>
+            </w:pPr>
+          </w:p>
+        </w:tc>
+        <w:tc>
+          <w:tcPr>
+            <w:tcW w:w="3006" w:type="dxa"/>
+          </w:tcPr>
+          <w:p>
+            <w:pPr>
+              <w:jc w:val="center"/>
+            </w:pPr>
+          </w:p>
+        </w:tc>
+        <w:tc>
+          <w:tcPr>
+            <w:tcW w:w="3006" w:type="dxa"/>
+          </w:tcPr>
+          <w:p>
+            <w:pPr>
+              <w:jc w:val="center"/>
+            </w:pPr>
+          </w:p>
+        </w:tc>
+      </w:tr>
+    </w:tbl>
+    <w:p/>
     <w:p>
       <w:pPr>
         <w:pStyle w:val="Heading1"/>
@@ -899,8 +1765,8 @@
           <w:szCs w:val="30"/>
         </w:rPr>
       </w:pPr>
-      <w:bookmarkStart w:id="1" w:name="_Toc219887142"/>
-      <w:bookmarkStart w:id="2" w:name="_Toc221889246"/>
+      <w:bookmarkStart w:id="2" w:name="_Toc219887142"/>
+      <w:bookmarkStart w:id="3" w:name="_Toc223612988"/>
       <w:r>
         <w:rPr>
           <w:rFonts w:asciiTheme="minorHAnsi" w:hAnsiTheme="minorHAnsi" w:cstheme="minorHAnsi"/>
@@ -928,9 +1794,249 @@
         </w:rPr>
         <w:t>:</w:t>
       </w:r>
-      <w:bookmarkEnd w:id="1"/>
       <w:bookmarkEnd w:id="2"/>
+      <w:bookmarkEnd w:id="3"/>
     </w:p>
+    <w:p/>
+    <w:p>
+      <w:pPr>
+        <w:pStyle w:val="Heading2"/>
+      </w:pPr>
+      <w:bookmarkStart w:id="4" w:name="_Toc223612989"/>
+      <w:r>
+        <w:lastRenderedPageBreak/>
+        <w:t>Sprint 2 Backlog:</w:t>
+      </w:r>
+      <w:bookmarkEnd w:id="4"/>
+      <w:r>
+        <w:t xml:space="preserve"> </w:t>
+      </w:r>
+    </w:p>
+    <w:tbl>
+      <w:tblPr>
+        <w:tblStyle w:val="TableGrid"/>
+        <w:tblW w:w="0" w:type="auto"/>
+        <w:tblLook w:val="04A0" w:firstRow="1" w:lastRow="0" w:firstColumn="1" w:lastColumn="0" w:noHBand="0" w:noVBand="1"/>
+      </w:tblPr>
+      <w:tblGrid>
+        <w:gridCol w:w="3004"/>
+        <w:gridCol w:w="3006"/>
+        <w:gridCol w:w="3006"/>
+      </w:tblGrid>
+      <w:tr>
+        <w:tc>
+          <w:tcPr>
+            <w:tcW w:w="3004" w:type="dxa"/>
+          </w:tcPr>
+          <w:p>
+            <w:pPr>
+              <w:jc w:val="center"/>
+              <w:rPr>
+                <w:b/>
+                <w:bCs/>
+              </w:rPr>
+            </w:pPr>
+            <w:r>
+              <w:rPr>
+                <w:b/>
+                <w:bCs/>
+              </w:rPr>
+              <w:t>Number</w:t>
+            </w:r>
+          </w:p>
+        </w:tc>
+        <w:tc>
+          <w:tcPr>
+            <w:tcW w:w="3006" w:type="dxa"/>
+          </w:tcPr>
+          <w:p>
+            <w:pPr>
+              <w:jc w:val="center"/>
+              <w:rPr>
+                <w:b/>
+                <w:bCs/>
+              </w:rPr>
+            </w:pPr>
+            <w:r>
+              <w:rPr>
+                <w:b/>
+                <w:bCs/>
+              </w:rPr>
+              <w:t>User Stories</w:t>
+            </w:r>
+          </w:p>
+        </w:tc>
+        <w:tc>
+          <w:tcPr>
+            <w:tcW w:w="3006" w:type="dxa"/>
+          </w:tcPr>
+          <w:p>
+            <w:pPr>
+              <w:jc w:val="center"/>
+              <w:rPr>
+                <w:b/>
+                <w:bCs/>
+              </w:rPr>
+            </w:pPr>
+            <w:r>
+              <w:rPr>
+                <w:b/>
+                <w:bCs/>
+              </w:rPr>
+              <w:t>Estimate</w:t>
+            </w:r>
+          </w:p>
+        </w:tc>
+      </w:tr>
+      <w:tr>
+        <w:tc>
+          <w:tcPr>
+            <w:tcW w:w="3004" w:type="dxa"/>
+          </w:tcPr>
+          <w:p>
+            <w:pPr>
+              <w:pStyle w:val="ListParagraph"/>
+              <w:numPr>
+                <w:ilvl w:val="0"/>
+                <w:numId w:val="34"/>
+              </w:numPr>
+            </w:pPr>
+            <w:r>
+              <w:t>Register / Log-in</w:t>
+            </w:r>
+          </w:p>
+        </w:tc>
+        <w:tc>
+          <w:tcPr>
+            <w:tcW w:w="3006" w:type="dxa"/>
+          </w:tcPr>
+          <w:p>
+            <w:pPr>
+              <w:jc w:val="center"/>
+            </w:pPr>
+            <w:r>
+              <w:t>As a patient user of the medical system, I want to have the ability to create an account and log-in so that I can access my personal details safe and securely.</w:t>
+            </w:r>
+          </w:p>
+        </w:tc>
+        <w:tc>
+          <w:tcPr>
+            <w:tcW w:w="3006" w:type="dxa"/>
+          </w:tcPr>
+          <w:p>
+            <w:pPr>
+              <w:jc w:val="center"/>
+            </w:pPr>
+            <w:r>
+              <w:t>40</w:t>
+            </w:r>
+          </w:p>
+        </w:tc>
+      </w:tr>
+      <w:tr>
+        <w:tc>
+          <w:tcPr>
+            <w:tcW w:w="3004" w:type="dxa"/>
+          </w:tcPr>
+          <w:p>
+            <w:pPr>
+              <w:pStyle w:val="ListParagraph"/>
+              <w:numPr>
+                <w:ilvl w:val="0"/>
+                <w:numId w:val="34"/>
+              </w:numPr>
+            </w:pPr>
+            <w:r>
+              <w:t>Logout</w:t>
+            </w:r>
+          </w:p>
+        </w:tc>
+        <w:tc>
+          <w:tcPr>
+            <w:tcW w:w="3006" w:type="dxa"/>
+          </w:tcPr>
+          <w:p>
+            <w:pPr>
+              <w:jc w:val="center"/>
+            </w:pPr>
+            <w:r>
+              <w:t>As a patient user of the medical system, I want to have the ability to logout so that my personal details remain secure after I'm done using the system.</w:t>
+            </w:r>
+          </w:p>
+          <w:p>
+            <w:pPr>
+              <w:jc w:val="center"/>
+            </w:pPr>
+          </w:p>
+        </w:tc>
+        <w:tc>
+          <w:tcPr>
+            <w:tcW w:w="3006" w:type="dxa"/>
+          </w:tcPr>
+          <w:p>
+            <w:pPr>
+              <w:jc w:val="center"/>
+            </w:pPr>
+            <w:r>
+              <w:t>13</w:t>
+            </w:r>
+          </w:p>
+        </w:tc>
+      </w:tr>
+      <w:tr>
+        <w:tc>
+          <w:tcPr>
+            <w:tcW w:w="3004" w:type="dxa"/>
+          </w:tcPr>
+          <w:p>
+            <w:pPr>
+              <w:pStyle w:val="ListParagraph"/>
+              <w:numPr>
+                <w:ilvl w:val="0"/>
+                <w:numId w:val="34"/>
+              </w:numPr>
+            </w:pPr>
+            <w:r>
+              <w:t xml:space="preserve">Secure Personal </w:t>
+            </w:r>
+          </w:p>
+        </w:tc>
+        <w:tc>
+          <w:tcPr>
+            <w:tcW w:w="3006" w:type="dxa"/>
+          </w:tcPr>
+          <w:p>
+            <w:pPr>
+              <w:jc w:val="center"/>
+            </w:pPr>
+            <w:r>
+              <w:t xml:space="preserve">As a patient user of the medical </w:t>
+            </w:r>
+            <w:r>
+              <w:t>system,</w:t>
+            </w:r>
+            <w:r>
+              <w:t xml:space="preserve"> I want to have a secure personal portal where I can add all my details securely so that every time I log in and I need to book an appointment I can just edit a couple of details and have everything sorted.</w:t>
+            </w:r>
+          </w:p>
+        </w:tc>
+        <w:tc>
+          <w:tcPr>
+            <w:tcW w:w="3006" w:type="dxa"/>
+          </w:tcPr>
+          <w:p>
+            <w:pPr>
+              <w:jc w:val="center"/>
+            </w:pPr>
+            <w:r>
+              <w:t>40</w:t>
+            </w:r>
+          </w:p>
+          <w:p/>
+        </w:tc>
+      </w:tr>
+    </w:tbl>
+    <w:p/>
     <w:p>
       <w:r>
         <w:t>As you can see the prototype for the registration page is different from the wireframe sketch and that is because it looks more professional, as you can see there are 4 different text boxes that are asking for email, password, date of birth and phone number, the password has a view password symbol where users are able to see their password and check it, additionally the data of birth has a calendar so you can select what day, month and year you are born. Further, we’ve added a logo with the name of our system and a create account button</w:t>
@@ -997,12 +2103,12 @@
           <w:i/>
           <w:iCs/>
         </w:rPr>
+        <w:lastRenderedPageBreak/>
         <w:t>Prototype 1 - Register</w:t>
       </w:r>
     </w:p>
     <w:p>
       <w:r>
-        <w:lastRenderedPageBreak/>
         <w:t>As you can see this is the prototype for the login page that we’ve came up with after doing the wireframe sketch, as visible here we went more in detail as we have a logo, with the name of our system, there are different buttons for login and register, also we’ve implemented the Login button that allows users to enter the system, 2 text boxes for email and password and a view password symbol which allows the users to check their password is good.</w:t>
       </w:r>
     </w:p>
@@ -1117,10 +2223,7 @@
         <w:t xml:space="preserve">section is </w:t>
       </w:r>
       <w:r>
-        <w:t>the</w:t>
-      </w:r>
-      <w:r>
-        <w:t xml:space="preserve"> main section is designed using a card-based layout with three primary options: Calendar, Appointments, and Records. Each card represents a core feature and allows users to easily navigate to different functionalities. The design focuses on simplicity, clarity, and user-friendly interaction, ensuring smooth navigation and an organized structure.</w:t>
+        <w:t>the main section is designed using a card-based layout with three primary options: Calendar, Appointments, and Records. Each card represents a core feature and allows users to easily navigate to different functionalities. The design focuses on simplicity, clarity, and user-friendly interaction, ensuring smooth navigation and an organized structure.</w:t>
       </w:r>
       <w:r>
         <w:t xml:space="preserve"> The difference between the prototype and the wireframe is, I have changed colours, made it more professionally, changed the shapes of the cards</w:t>
@@ -1155,7 +2258,9 @@
           <w:bCs/>
           <w:i/>
           <w:iCs/>
+          <w:noProof/>
         </w:rPr>
+        <w:lastRenderedPageBreak/>
         <w:drawing>
           <wp:inline distT="0" distB="0" distL="0" distR="0" wp14:anchorId="05897F2A" wp14:editId="12D3F811">
             <wp:extent cx="5731510" cy="2721610"/>
@@ -1209,7 +2314,6 @@
           <w:i/>
           <w:iCs/>
         </w:rPr>
-        <w:lastRenderedPageBreak/>
         <w:t xml:space="preserve">Prototype 3- Main page </w:t>
       </w:r>
     </w:p>
@@ -1223,7 +2327,7 @@
           <w:szCs w:val="30"/>
         </w:rPr>
       </w:pPr>
-      <w:bookmarkStart w:id="3" w:name="_Toc221889247"/>
+      <w:bookmarkStart w:id="5" w:name="_Toc223612990"/>
       <w:r>
         <w:rPr>
           <w:rFonts w:asciiTheme="minorHAnsi" w:hAnsiTheme="minorHAnsi" w:cstheme="minorHAnsi"/>
@@ -1251,7 +2355,7 @@
         </w:rPr>
         <w:t>:</w:t>
       </w:r>
-      <w:bookmarkEnd w:id="3"/>
+      <w:bookmarkEnd w:id="5"/>
     </w:p>
     <w:p/>
     <w:p>
@@ -1264,7 +2368,7 @@
           <w:szCs w:val="30"/>
         </w:rPr>
       </w:pPr>
-      <w:bookmarkStart w:id="4" w:name="_Toc221889248"/>
+      <w:bookmarkStart w:id="6" w:name="_Toc223612991"/>
       <w:r>
         <w:rPr>
           <w:rFonts w:asciiTheme="minorHAnsi" w:hAnsiTheme="minorHAnsi" w:cstheme="minorHAnsi"/>
@@ -1283,7 +2387,7 @@
         </w:rPr>
         <w:t>:</w:t>
       </w:r>
-      <w:bookmarkEnd w:id="4"/>
+      <w:bookmarkEnd w:id="6"/>
     </w:p>
     <w:p/>
     <w:sectPr>
@@ -2307,6 +3411,273 @@
     </w:lvl>
   </w:abstractNum>
   <w:abstractNum w:abstractNumId="9" w15:restartNumberingAfterBreak="0">
+    <w:nsid w:val="288A6DEC"/>
+    <w:multiLevelType w:val="hybridMultilevel"/>
+    <w:tmpl w:val="5124487E"/>
+    <w:lvl w:ilvl="0" w:tplc="0809000F">
+      <w:start w:val="1"/>
+      <w:numFmt w:val="decimal"/>
+      <w:lvlText w:val="%1."/>
+      <w:lvlJc w:val="left"/>
+      <w:pPr>
+        <w:ind w:left="720" w:hanging="360"/>
+      </w:pPr>
+      <w:rPr>
+        <w:rFonts w:hint="default"/>
+      </w:rPr>
+    </w:lvl>
+    <w:lvl w:ilvl="1" w:tplc="08090019" w:tentative="1">
+      <w:start w:val="1"/>
+      <w:numFmt w:val="lowerLetter"/>
+      <w:lvlText w:val="%2."/>
+      <w:lvlJc w:val="left"/>
+      <w:pPr>
+        <w:ind w:left="1440" w:hanging="360"/>
+      </w:pPr>
+    </w:lvl>
+    <w:lvl w:ilvl="2" w:tplc="0809001B" w:tentative="1">
+      <w:start w:val="1"/>
+      <w:numFmt w:val="lowerRoman"/>
+      <w:lvlText w:val="%3."/>
+      <w:lvlJc w:val="right"/>
+      <w:pPr>
+        <w:ind w:left="2160" w:hanging="180"/>
+      </w:pPr>
+    </w:lvl>
+    <w:lvl w:ilvl="3" w:tplc="0809000F" w:tentative="1">
+      <w:start w:val="1"/>
+      <w:numFmt w:val="decimal"/>
+      <w:lvlText w:val="%4."/>
+      <w:lvlJc w:val="left"/>
+      <w:pPr>
+        <w:ind w:left="2880" w:hanging="360"/>
+      </w:pPr>
+    </w:lvl>
+    <w:lvl w:ilvl="4" w:tplc="08090019" w:tentative="1">
+      <w:start w:val="1"/>
+      <w:numFmt w:val="lowerLetter"/>
+      <w:lvlText w:val="%5."/>
+      <w:lvlJc w:val="left"/>
+      <w:pPr>
+        <w:ind w:left="3600" w:hanging="360"/>
+      </w:pPr>
+    </w:lvl>
+    <w:lvl w:ilvl="5" w:tplc="0809001B" w:tentative="1">
+      <w:start w:val="1"/>
+      <w:numFmt w:val="lowerRoman"/>
+      <w:lvlText w:val="%6."/>
+      <w:lvlJc w:val="right"/>
+      <w:pPr>
+        <w:ind w:left="4320" w:hanging="180"/>
+      </w:pPr>
+    </w:lvl>
+    <w:lvl w:ilvl="6" w:tplc="0809000F" w:tentative="1">
+      <w:start w:val="1"/>
+      <w:numFmt w:val="decimal"/>
+      <w:lvlText w:val="%7."/>
+      <w:lvlJc w:val="left"/>
+      <w:pPr>
+        <w:ind w:left="5040" w:hanging="360"/>
+      </w:pPr>
+    </w:lvl>
+    <w:lvl w:ilvl="7" w:tplc="08090019" w:tentative="1">
+      <w:start w:val="1"/>
+      <w:numFmt w:val="lowerLetter"/>
+      <w:lvlText w:val="%8."/>
+      <w:lvlJc w:val="left"/>
+      <w:pPr>
+        <w:ind w:left="5760" w:hanging="360"/>
+      </w:pPr>
+    </w:lvl>
+    <w:lvl w:ilvl="8" w:tplc="0809001B" w:tentative="1">
+      <w:start w:val="1"/>
+      <w:numFmt w:val="lowerRoman"/>
+      <w:lvlText w:val="%9."/>
+      <w:lvlJc w:val="right"/>
+      <w:pPr>
+        <w:ind w:left="6480" w:hanging="180"/>
+      </w:pPr>
+    </w:lvl>
+  </w:abstractNum>
+  <w:abstractNum w:abstractNumId="10" w15:restartNumberingAfterBreak="0">
+    <w:nsid w:val="28EB7F8E"/>
+    <w:multiLevelType w:val="hybridMultilevel"/>
+    <w:tmpl w:val="5CC0C4F0"/>
+    <w:lvl w:ilvl="0" w:tplc="0809000F">
+      <w:start w:val="1"/>
+      <w:numFmt w:val="decimal"/>
+      <w:lvlText w:val="%1."/>
+      <w:lvlJc w:val="left"/>
+      <w:pPr>
+        <w:ind w:left="720" w:hanging="360"/>
+      </w:pPr>
+      <w:rPr>
+        <w:rFonts w:hint="default"/>
+      </w:rPr>
+    </w:lvl>
+    <w:lvl w:ilvl="1" w:tplc="08090019" w:tentative="1">
+      <w:start w:val="1"/>
+      <w:numFmt w:val="lowerLetter"/>
+      <w:lvlText w:val="%2."/>
+      <w:lvlJc w:val="left"/>
+      <w:pPr>
+        <w:ind w:left="1440" w:hanging="360"/>
+      </w:pPr>
+    </w:lvl>
+    <w:lvl w:ilvl="2" w:tplc="0809001B" w:tentative="1">
+      <w:start w:val="1"/>
+      <w:numFmt w:val="lowerRoman"/>
+      <w:lvlText w:val="%3."/>
+      <w:lvlJc w:val="right"/>
+      <w:pPr>
+        <w:ind w:left="2160" w:hanging="180"/>
+      </w:pPr>
+    </w:lvl>
+    <w:lvl w:ilvl="3" w:tplc="0809000F" w:tentative="1">
+      <w:start w:val="1"/>
+      <w:numFmt w:val="decimal"/>
+      <w:lvlText w:val="%4."/>
+      <w:lvlJc w:val="left"/>
+      <w:pPr>
+        <w:ind w:left="2880" w:hanging="360"/>
+      </w:pPr>
+    </w:lvl>
+    <w:lvl w:ilvl="4" w:tplc="08090019" w:tentative="1">
+      <w:start w:val="1"/>
+      <w:numFmt w:val="lowerLetter"/>
+      <w:lvlText w:val="%5."/>
+      <w:lvlJc w:val="left"/>
+      <w:pPr>
+        <w:ind w:left="3600" w:hanging="360"/>
+      </w:pPr>
+    </w:lvl>
+    <w:lvl w:ilvl="5" w:tplc="0809001B" w:tentative="1">
+      <w:start w:val="1"/>
+      <w:numFmt w:val="lowerRoman"/>
+      <w:lvlText w:val="%6."/>
+      <w:lvlJc w:val="right"/>
+      <w:pPr>
+        <w:ind w:left="4320" w:hanging="180"/>
+      </w:pPr>
+    </w:lvl>
+    <w:lvl w:ilvl="6" w:tplc="0809000F" w:tentative="1">
+      <w:start w:val="1"/>
+      <w:numFmt w:val="decimal"/>
+      <w:lvlText w:val="%7."/>
+      <w:lvlJc w:val="left"/>
+      <w:pPr>
+        <w:ind w:left="5040" w:hanging="360"/>
+      </w:pPr>
+    </w:lvl>
+    <w:lvl w:ilvl="7" w:tplc="08090019" w:tentative="1">
+      <w:start w:val="1"/>
+      <w:numFmt w:val="lowerLetter"/>
+      <w:lvlText w:val="%8."/>
+      <w:lvlJc w:val="left"/>
+      <w:pPr>
+        <w:ind w:left="5760" w:hanging="360"/>
+      </w:pPr>
+    </w:lvl>
+    <w:lvl w:ilvl="8" w:tplc="0809001B" w:tentative="1">
+      <w:start w:val="1"/>
+      <w:numFmt w:val="lowerRoman"/>
+      <w:lvlText w:val="%9."/>
+      <w:lvlJc w:val="right"/>
+      <w:pPr>
+        <w:ind w:left="6480" w:hanging="180"/>
+      </w:pPr>
+    </w:lvl>
+  </w:abstractNum>
+  <w:abstractNum w:abstractNumId="11" w15:restartNumberingAfterBreak="0">
+    <w:nsid w:val="2EC75058"/>
+    <w:multiLevelType w:val="hybridMultilevel"/>
+    <w:tmpl w:val="C246A384"/>
+    <w:lvl w:ilvl="0" w:tplc="DF86AFEE">
+      <w:start w:val="1"/>
+      <w:numFmt w:val="decimal"/>
+      <w:lvlText w:val="%1."/>
+      <w:lvlJc w:val="left"/>
+      <w:pPr>
+        <w:ind w:left="1080" w:hanging="360"/>
+      </w:pPr>
+      <w:rPr>
+        <w:rFonts w:hint="default"/>
+      </w:rPr>
+    </w:lvl>
+    <w:lvl w:ilvl="1" w:tplc="08090019" w:tentative="1">
+      <w:start w:val="1"/>
+      <w:numFmt w:val="lowerLetter"/>
+      <w:lvlText w:val="%2."/>
+      <w:lvlJc w:val="left"/>
+      <w:pPr>
+        <w:ind w:left="1800" w:hanging="360"/>
+      </w:pPr>
+    </w:lvl>
+    <w:lvl w:ilvl="2" w:tplc="0809001B" w:tentative="1">
+      <w:start w:val="1"/>
+      <w:numFmt w:val="lowerRoman"/>
+      <w:lvlText w:val="%3."/>
+      <w:lvlJc w:val="right"/>
+      <w:pPr>
+        <w:ind w:left="2520" w:hanging="180"/>
+      </w:pPr>
+    </w:lvl>
+    <w:lvl w:ilvl="3" w:tplc="0809000F" w:tentative="1">
+      <w:start w:val="1"/>
+      <w:numFmt w:val="decimal"/>
+      <w:lvlText w:val="%4."/>
+      <w:lvlJc w:val="left"/>
+      <w:pPr>
+        <w:ind w:left="3240" w:hanging="360"/>
+      </w:pPr>
+    </w:lvl>
+    <w:lvl w:ilvl="4" w:tplc="08090019" w:tentative="1">
+      <w:start w:val="1"/>
+      <w:numFmt w:val="lowerLetter"/>
+      <w:lvlText w:val="%5."/>
+      <w:lvlJc w:val="left"/>
+      <w:pPr>
+        <w:ind w:left="3960" w:hanging="360"/>
+      </w:pPr>
+    </w:lvl>
+    <w:lvl w:ilvl="5" w:tplc="0809001B" w:tentative="1">
+      <w:start w:val="1"/>
+      <w:numFmt w:val="lowerRoman"/>
+      <w:lvlText w:val="%6."/>
+      <w:lvlJc w:val="right"/>
+      <w:pPr>
+        <w:ind w:left="4680" w:hanging="180"/>
+      </w:pPr>
+    </w:lvl>
+    <w:lvl w:ilvl="6" w:tplc="0809000F" w:tentative="1">
+      <w:start w:val="1"/>
+      <w:numFmt w:val="decimal"/>
+      <w:lvlText w:val="%7."/>
+      <w:lvlJc w:val="left"/>
+      <w:pPr>
+        <w:ind w:left="5400" w:hanging="360"/>
+      </w:pPr>
+    </w:lvl>
+    <w:lvl w:ilvl="7" w:tplc="08090019" w:tentative="1">
+      <w:start w:val="1"/>
+      <w:numFmt w:val="lowerLetter"/>
+      <w:lvlText w:val="%8."/>
+      <w:lvlJc w:val="left"/>
+      <w:pPr>
+        <w:ind w:left="6120" w:hanging="360"/>
+      </w:pPr>
+    </w:lvl>
+    <w:lvl w:ilvl="8" w:tplc="0809001B" w:tentative="1">
+      <w:start w:val="1"/>
+      <w:numFmt w:val="lowerRoman"/>
+      <w:lvlText w:val="%9."/>
+      <w:lvlJc w:val="right"/>
+      <w:pPr>
+        <w:ind w:left="6840" w:hanging="180"/>
+      </w:pPr>
+    </w:lvl>
+  </w:abstractNum>
+  <w:abstractNum w:abstractNumId="12" w15:restartNumberingAfterBreak="0">
     <w:nsid w:val="31140428"/>
     <w:multiLevelType w:val="hybridMultilevel"/>
     <w:tmpl w:val="D27088B4"/>
@@ -2395,7 +3766,96 @@
       </w:pPr>
     </w:lvl>
   </w:abstractNum>
-  <w:abstractNum w:abstractNumId="10" w15:restartNumberingAfterBreak="0">
+  <w:abstractNum w:abstractNumId="13" w15:restartNumberingAfterBreak="0">
+    <w:nsid w:val="357F156C"/>
+    <w:multiLevelType w:val="hybridMultilevel"/>
+    <w:tmpl w:val="FC4EF1CA"/>
+    <w:lvl w:ilvl="0" w:tplc="D7D2117A">
+      <w:start w:val="1"/>
+      <w:numFmt w:val="decimal"/>
+      <w:lvlText w:val="%1."/>
+      <w:lvlJc w:val="left"/>
+      <w:pPr>
+        <w:ind w:left="1800" w:hanging="360"/>
+      </w:pPr>
+      <w:rPr>
+        <w:rFonts w:hint="default"/>
+      </w:rPr>
+    </w:lvl>
+    <w:lvl w:ilvl="1" w:tplc="08090019" w:tentative="1">
+      <w:start w:val="1"/>
+      <w:numFmt w:val="lowerLetter"/>
+      <w:lvlText w:val="%2."/>
+      <w:lvlJc w:val="left"/>
+      <w:pPr>
+        <w:ind w:left="2520" w:hanging="360"/>
+      </w:pPr>
+    </w:lvl>
+    <w:lvl w:ilvl="2" w:tplc="0809001B" w:tentative="1">
+      <w:start w:val="1"/>
+      <w:numFmt w:val="lowerRoman"/>
+      <w:lvlText w:val="%3."/>
+      <w:lvlJc w:val="right"/>
+      <w:pPr>
+        <w:ind w:left="3240" w:hanging="180"/>
+      </w:pPr>
+    </w:lvl>
+    <w:lvl w:ilvl="3" w:tplc="0809000F" w:tentative="1">
+      <w:start w:val="1"/>
+      <w:numFmt w:val="decimal"/>
+      <w:lvlText w:val="%4."/>
+      <w:lvlJc w:val="left"/>
+      <w:pPr>
+        <w:ind w:left="3960" w:hanging="360"/>
+      </w:pPr>
+    </w:lvl>
+    <w:lvl w:ilvl="4" w:tplc="08090019" w:tentative="1">
+      <w:start w:val="1"/>
+      <w:numFmt w:val="lowerLetter"/>
+      <w:lvlText w:val="%5."/>
+      <w:lvlJc w:val="left"/>
+      <w:pPr>
+        <w:ind w:left="4680" w:hanging="360"/>
+      </w:pPr>
+    </w:lvl>
+    <w:lvl w:ilvl="5" w:tplc="0809001B" w:tentative="1">
+      <w:start w:val="1"/>
+      <w:numFmt w:val="lowerRoman"/>
+      <w:lvlText w:val="%6."/>
+      <w:lvlJc w:val="right"/>
+      <w:pPr>
+        <w:ind w:left="5400" w:hanging="180"/>
+      </w:pPr>
+    </w:lvl>
+    <w:lvl w:ilvl="6" w:tplc="0809000F" w:tentative="1">
+      <w:start w:val="1"/>
+      <w:numFmt w:val="decimal"/>
+      <w:lvlText w:val="%7."/>
+      <w:lvlJc w:val="left"/>
+      <w:pPr>
+        <w:ind w:left="6120" w:hanging="360"/>
+      </w:pPr>
+    </w:lvl>
+    <w:lvl w:ilvl="7" w:tplc="08090019" w:tentative="1">
+      <w:start w:val="1"/>
+      <w:numFmt w:val="lowerLetter"/>
+      <w:lvlText w:val="%8."/>
+      <w:lvlJc w:val="left"/>
+      <w:pPr>
+        <w:ind w:left="6840" w:hanging="360"/>
+      </w:pPr>
+    </w:lvl>
+    <w:lvl w:ilvl="8" w:tplc="0809001B" w:tentative="1">
+      <w:start w:val="1"/>
+      <w:numFmt w:val="lowerRoman"/>
+      <w:lvlText w:val="%9."/>
+      <w:lvlJc w:val="right"/>
+      <w:pPr>
+        <w:ind w:left="7560" w:hanging="180"/>
+      </w:pPr>
+    </w:lvl>
+  </w:abstractNum>
+  <w:abstractNum w:abstractNumId="14" w15:restartNumberingAfterBreak="0">
     <w:nsid w:val="35C57AC8"/>
     <w:multiLevelType w:val="hybridMultilevel"/>
     <w:tmpl w:val="A5202662"/>
@@ -2484,7 +3944,96 @@
       </w:pPr>
     </w:lvl>
   </w:abstractNum>
-  <w:abstractNum w:abstractNumId="11" w15:restartNumberingAfterBreak="0">
+  <w:abstractNum w:abstractNumId="15" w15:restartNumberingAfterBreak="0">
+    <w:nsid w:val="38320487"/>
+    <w:multiLevelType w:val="hybridMultilevel"/>
+    <w:tmpl w:val="40E02F92"/>
+    <w:lvl w:ilvl="0" w:tplc="0809000F">
+      <w:start w:val="1"/>
+      <w:numFmt w:val="decimal"/>
+      <w:lvlText w:val="%1."/>
+      <w:lvlJc w:val="left"/>
+      <w:pPr>
+        <w:ind w:left="720" w:hanging="360"/>
+      </w:pPr>
+      <w:rPr>
+        <w:rFonts w:hint="default"/>
+      </w:rPr>
+    </w:lvl>
+    <w:lvl w:ilvl="1" w:tplc="08090019" w:tentative="1">
+      <w:start w:val="1"/>
+      <w:numFmt w:val="lowerLetter"/>
+      <w:lvlText w:val="%2."/>
+      <w:lvlJc w:val="left"/>
+      <w:pPr>
+        <w:ind w:left="1440" w:hanging="360"/>
+      </w:pPr>
+    </w:lvl>
+    <w:lvl w:ilvl="2" w:tplc="0809001B" w:tentative="1">
+      <w:start w:val="1"/>
+      <w:numFmt w:val="lowerRoman"/>
+      <w:lvlText w:val="%3."/>
+      <w:lvlJc w:val="right"/>
+      <w:pPr>
+        <w:ind w:left="2160" w:hanging="180"/>
+      </w:pPr>
+    </w:lvl>
+    <w:lvl w:ilvl="3" w:tplc="0809000F" w:tentative="1">
+      <w:start w:val="1"/>
+      <w:numFmt w:val="decimal"/>
+      <w:lvlText w:val="%4."/>
+      <w:lvlJc w:val="left"/>
+      <w:pPr>
+        <w:ind w:left="2880" w:hanging="360"/>
+      </w:pPr>
+    </w:lvl>
+    <w:lvl w:ilvl="4" w:tplc="08090019" w:tentative="1">
+      <w:start w:val="1"/>
+      <w:numFmt w:val="lowerLetter"/>
+      <w:lvlText w:val="%5."/>
+      <w:lvlJc w:val="left"/>
+      <w:pPr>
+        <w:ind w:left="3600" w:hanging="360"/>
+      </w:pPr>
+    </w:lvl>
+    <w:lvl w:ilvl="5" w:tplc="0809001B" w:tentative="1">
+      <w:start w:val="1"/>
+      <w:numFmt w:val="lowerRoman"/>
+      <w:lvlText w:val="%6."/>
+      <w:lvlJc w:val="right"/>
+      <w:pPr>
+        <w:ind w:left="4320" w:hanging="180"/>
+      </w:pPr>
+    </w:lvl>
+    <w:lvl w:ilvl="6" w:tplc="0809000F" w:tentative="1">
+      <w:start w:val="1"/>
+      <w:numFmt w:val="decimal"/>
+      <w:lvlText w:val="%7."/>
+      <w:lvlJc w:val="left"/>
+      <w:pPr>
+        <w:ind w:left="5040" w:hanging="360"/>
+      </w:pPr>
+    </w:lvl>
+    <w:lvl w:ilvl="7" w:tplc="08090019" w:tentative="1">
+      <w:start w:val="1"/>
+      <w:numFmt w:val="lowerLetter"/>
+      <w:lvlText w:val="%8."/>
+      <w:lvlJc w:val="left"/>
+      <w:pPr>
+        <w:ind w:left="5760" w:hanging="360"/>
+      </w:pPr>
+    </w:lvl>
+    <w:lvl w:ilvl="8" w:tplc="0809001B" w:tentative="1">
+      <w:start w:val="1"/>
+      <w:numFmt w:val="lowerRoman"/>
+      <w:lvlText w:val="%9."/>
+      <w:lvlJc w:val="right"/>
+      <w:pPr>
+        <w:ind w:left="6480" w:hanging="180"/>
+      </w:pPr>
+    </w:lvl>
+  </w:abstractNum>
+  <w:abstractNum w:abstractNumId="16" w15:restartNumberingAfterBreak="0">
     <w:nsid w:val="414B0C3E"/>
     <w:multiLevelType w:val="hybridMultilevel"/>
     <w:tmpl w:val="329AA942"/>
@@ -2596,7 +4145,7 @@
       </w:rPr>
     </w:lvl>
   </w:abstractNum>
-  <w:abstractNum w:abstractNumId="12" w15:restartNumberingAfterBreak="0">
+  <w:abstractNum w:abstractNumId="17" w15:restartNumberingAfterBreak="0">
     <w:nsid w:val="42BC6810"/>
     <w:multiLevelType w:val="hybridMultilevel"/>
     <w:tmpl w:val="066EEC78"/>
@@ -2708,7 +4257,7 @@
       </w:rPr>
     </w:lvl>
   </w:abstractNum>
-  <w:abstractNum w:abstractNumId="13" w15:restartNumberingAfterBreak="0">
+  <w:abstractNum w:abstractNumId="18" w15:restartNumberingAfterBreak="0">
     <w:nsid w:val="498943F7"/>
     <w:multiLevelType w:val="hybridMultilevel"/>
     <w:tmpl w:val="7840C128"/>
@@ -2800,7 +4349,7 @@
       </w:pPr>
     </w:lvl>
   </w:abstractNum>
-  <w:abstractNum w:abstractNumId="14" w15:restartNumberingAfterBreak="0">
+  <w:abstractNum w:abstractNumId="19" w15:restartNumberingAfterBreak="0">
     <w:nsid w:val="4D4646D9"/>
     <w:multiLevelType w:val="hybridMultilevel"/>
     <w:tmpl w:val="2294C8A8"/>
@@ -2912,7 +4461,96 @@
       </w:rPr>
     </w:lvl>
   </w:abstractNum>
-  <w:abstractNum w:abstractNumId="15" w15:restartNumberingAfterBreak="0">
+  <w:abstractNum w:abstractNumId="20" w15:restartNumberingAfterBreak="0">
+    <w:nsid w:val="4D4E5F6A"/>
+    <w:multiLevelType w:val="hybridMultilevel"/>
+    <w:tmpl w:val="7E448D3C"/>
+    <w:lvl w:ilvl="0" w:tplc="745A17E2">
+      <w:start w:val="1"/>
+      <w:numFmt w:val="decimal"/>
+      <w:lvlText w:val="%1."/>
+      <w:lvlJc w:val="left"/>
+      <w:pPr>
+        <w:ind w:left="1440" w:hanging="360"/>
+      </w:pPr>
+      <w:rPr>
+        <w:rFonts w:hint="default"/>
+      </w:rPr>
+    </w:lvl>
+    <w:lvl w:ilvl="1" w:tplc="08090019" w:tentative="1">
+      <w:start w:val="1"/>
+      <w:numFmt w:val="lowerLetter"/>
+      <w:lvlText w:val="%2."/>
+      <w:lvlJc w:val="left"/>
+      <w:pPr>
+        <w:ind w:left="2160" w:hanging="360"/>
+      </w:pPr>
+    </w:lvl>
+    <w:lvl w:ilvl="2" w:tplc="0809001B" w:tentative="1">
+      <w:start w:val="1"/>
+      <w:numFmt w:val="lowerRoman"/>
+      <w:lvlText w:val="%3."/>
+      <w:lvlJc w:val="right"/>
+      <w:pPr>
+        <w:ind w:left="2880" w:hanging="180"/>
+      </w:pPr>
+    </w:lvl>
+    <w:lvl w:ilvl="3" w:tplc="0809000F" w:tentative="1">
+      <w:start w:val="1"/>
+      <w:numFmt w:val="decimal"/>
+      <w:lvlText w:val="%4."/>
+      <w:lvlJc w:val="left"/>
+      <w:pPr>
+        <w:ind w:left="3600" w:hanging="360"/>
+      </w:pPr>
+    </w:lvl>
+    <w:lvl w:ilvl="4" w:tplc="08090019" w:tentative="1">
+      <w:start w:val="1"/>
+      <w:numFmt w:val="lowerLetter"/>
+      <w:lvlText w:val="%5."/>
+      <w:lvlJc w:val="left"/>
+      <w:pPr>
+        <w:ind w:left="4320" w:hanging="360"/>
+      </w:pPr>
+    </w:lvl>
+    <w:lvl w:ilvl="5" w:tplc="0809001B" w:tentative="1">
+      <w:start w:val="1"/>
+      <w:numFmt w:val="lowerRoman"/>
+      <w:lvlText w:val="%6."/>
+      <w:lvlJc w:val="right"/>
+      <w:pPr>
+        <w:ind w:left="5040" w:hanging="180"/>
+      </w:pPr>
+    </w:lvl>
+    <w:lvl w:ilvl="6" w:tplc="0809000F" w:tentative="1">
+      <w:start w:val="1"/>
+      <w:numFmt w:val="decimal"/>
+      <w:lvlText w:val="%7."/>
+      <w:lvlJc w:val="left"/>
+      <w:pPr>
+        <w:ind w:left="5760" w:hanging="360"/>
+      </w:pPr>
+    </w:lvl>
+    <w:lvl w:ilvl="7" w:tplc="08090019" w:tentative="1">
+      <w:start w:val="1"/>
+      <w:numFmt w:val="lowerLetter"/>
+      <w:lvlText w:val="%8."/>
+      <w:lvlJc w:val="left"/>
+      <w:pPr>
+        <w:ind w:left="6480" w:hanging="360"/>
+      </w:pPr>
+    </w:lvl>
+    <w:lvl w:ilvl="8" w:tplc="0809001B" w:tentative="1">
+      <w:start w:val="1"/>
+      <w:numFmt w:val="lowerRoman"/>
+      <w:lvlText w:val="%9."/>
+      <w:lvlJc w:val="right"/>
+      <w:pPr>
+        <w:ind w:left="7200" w:hanging="180"/>
+      </w:pPr>
+    </w:lvl>
+  </w:abstractNum>
+  <w:abstractNum w:abstractNumId="21" w15:restartNumberingAfterBreak="0">
     <w:nsid w:val="4DB43EF7"/>
     <w:multiLevelType w:val="hybridMultilevel"/>
     <w:tmpl w:val="B5B6B496"/>
@@ -3024,7 +4662,7 @@
       </w:rPr>
     </w:lvl>
   </w:abstractNum>
-  <w:abstractNum w:abstractNumId="16" w15:restartNumberingAfterBreak="0">
+  <w:abstractNum w:abstractNumId="22" w15:restartNumberingAfterBreak="0">
     <w:nsid w:val="52AD7C01"/>
     <w:multiLevelType w:val="hybridMultilevel"/>
     <w:tmpl w:val="26DC49EC"/>
@@ -3136,7 +4774,7 @@
       </w:rPr>
     </w:lvl>
   </w:abstractNum>
-  <w:abstractNum w:abstractNumId="17" w15:restartNumberingAfterBreak="0">
+  <w:abstractNum w:abstractNumId="23" w15:restartNumberingAfterBreak="0">
     <w:nsid w:val="5639143F"/>
     <w:multiLevelType w:val="hybridMultilevel"/>
     <w:tmpl w:val="A57612E4"/>
@@ -3248,7 +4886,7 @@
       </w:rPr>
     </w:lvl>
   </w:abstractNum>
-  <w:abstractNum w:abstractNumId="18" w15:restartNumberingAfterBreak="0">
+  <w:abstractNum w:abstractNumId="24" w15:restartNumberingAfterBreak="0">
     <w:nsid w:val="57DD0EA0"/>
     <w:multiLevelType w:val="hybridMultilevel"/>
     <w:tmpl w:val="3C4EECC8"/>
@@ -3360,7 +4998,7 @@
       </w:rPr>
     </w:lvl>
   </w:abstractNum>
-  <w:abstractNum w:abstractNumId="19" w15:restartNumberingAfterBreak="0">
+  <w:abstractNum w:abstractNumId="25" w15:restartNumberingAfterBreak="0">
     <w:nsid w:val="5ABC2B1A"/>
     <w:multiLevelType w:val="hybridMultilevel"/>
     <w:tmpl w:val="6C2C37AA"/>
@@ -3473,7 +5111,7 @@
       </w:rPr>
     </w:lvl>
   </w:abstractNum>
-  <w:abstractNum w:abstractNumId="20" w15:restartNumberingAfterBreak="0">
+  <w:abstractNum w:abstractNumId="26" w15:restartNumberingAfterBreak="0">
     <w:nsid w:val="5B8F3918"/>
     <w:multiLevelType w:val="hybridMultilevel"/>
     <w:tmpl w:val="7700DEEC"/>
@@ -3563,7 +5201,7 @@
       </w:pPr>
     </w:lvl>
   </w:abstractNum>
-  <w:abstractNum w:abstractNumId="21" w15:restartNumberingAfterBreak="0">
+  <w:abstractNum w:abstractNumId="27" w15:restartNumberingAfterBreak="0">
     <w:nsid w:val="63C24ED5"/>
     <w:multiLevelType w:val="hybridMultilevel"/>
     <w:tmpl w:val="7C9AA8EC"/>
@@ -3675,7 +5313,7 @@
       </w:rPr>
     </w:lvl>
   </w:abstractNum>
-  <w:abstractNum w:abstractNumId="22" w15:restartNumberingAfterBreak="0">
+  <w:abstractNum w:abstractNumId="28" w15:restartNumberingAfterBreak="0">
     <w:nsid w:val="64FB3FD3"/>
     <w:multiLevelType w:val="hybridMultilevel"/>
     <w:tmpl w:val="514C6A78"/>
@@ -3787,7 +5425,7 @@
       </w:rPr>
     </w:lvl>
   </w:abstractNum>
-  <w:abstractNum w:abstractNumId="23" w15:restartNumberingAfterBreak="0">
+  <w:abstractNum w:abstractNumId="29" w15:restartNumberingAfterBreak="0">
     <w:nsid w:val="666F7D0C"/>
     <w:multiLevelType w:val="hybridMultilevel"/>
     <w:tmpl w:val="10307882"/>
@@ -3876,7 +5514,7 @@
       </w:pPr>
     </w:lvl>
   </w:abstractNum>
-  <w:abstractNum w:abstractNumId="24" w15:restartNumberingAfterBreak="0">
+  <w:abstractNum w:abstractNumId="30" w15:restartNumberingAfterBreak="0">
     <w:nsid w:val="75E0664C"/>
     <w:multiLevelType w:val="hybridMultilevel"/>
     <w:tmpl w:val="798C63F0"/>
@@ -3988,7 +5626,7 @@
       </w:rPr>
     </w:lvl>
   </w:abstractNum>
-  <w:abstractNum w:abstractNumId="25" w15:restartNumberingAfterBreak="0">
+  <w:abstractNum w:abstractNumId="31" w15:restartNumberingAfterBreak="0">
     <w:nsid w:val="760037D4"/>
     <w:multiLevelType w:val="hybridMultilevel"/>
     <w:tmpl w:val="A19EC902"/>
@@ -4101,7 +5739,7 @@
       </w:rPr>
     </w:lvl>
   </w:abstractNum>
-  <w:abstractNum w:abstractNumId="26" w15:restartNumberingAfterBreak="0">
+  <w:abstractNum w:abstractNumId="32" w15:restartNumberingAfterBreak="0">
     <w:nsid w:val="7E1409E7"/>
     <w:multiLevelType w:val="hybridMultilevel"/>
     <w:tmpl w:val="D0EEE388"/>
@@ -4190,11 +5828,100 @@
       </w:pPr>
     </w:lvl>
   </w:abstractNum>
+  <w:abstractNum w:abstractNumId="33" w15:restartNumberingAfterBreak="0">
+    <w:nsid w:val="7E40257D"/>
+    <w:multiLevelType w:val="hybridMultilevel"/>
+    <w:tmpl w:val="5A38A51E"/>
+    <w:lvl w:ilvl="0" w:tplc="0809000F">
+      <w:start w:val="1"/>
+      <w:numFmt w:val="decimal"/>
+      <w:lvlText w:val="%1."/>
+      <w:lvlJc w:val="left"/>
+      <w:pPr>
+        <w:ind w:left="720" w:hanging="360"/>
+      </w:pPr>
+      <w:rPr>
+        <w:rFonts w:hint="default"/>
+      </w:rPr>
+    </w:lvl>
+    <w:lvl w:ilvl="1" w:tplc="08090019" w:tentative="1">
+      <w:start w:val="1"/>
+      <w:numFmt w:val="lowerLetter"/>
+      <w:lvlText w:val="%2."/>
+      <w:lvlJc w:val="left"/>
+      <w:pPr>
+        <w:ind w:left="1440" w:hanging="360"/>
+      </w:pPr>
+    </w:lvl>
+    <w:lvl w:ilvl="2" w:tplc="0809001B" w:tentative="1">
+      <w:start w:val="1"/>
+      <w:numFmt w:val="lowerRoman"/>
+      <w:lvlText w:val="%3."/>
+      <w:lvlJc w:val="right"/>
+      <w:pPr>
+        <w:ind w:left="2160" w:hanging="180"/>
+      </w:pPr>
+    </w:lvl>
+    <w:lvl w:ilvl="3" w:tplc="0809000F" w:tentative="1">
+      <w:start w:val="1"/>
+      <w:numFmt w:val="decimal"/>
+      <w:lvlText w:val="%4."/>
+      <w:lvlJc w:val="left"/>
+      <w:pPr>
+        <w:ind w:left="2880" w:hanging="360"/>
+      </w:pPr>
+    </w:lvl>
+    <w:lvl w:ilvl="4" w:tplc="08090019" w:tentative="1">
+      <w:start w:val="1"/>
+      <w:numFmt w:val="lowerLetter"/>
+      <w:lvlText w:val="%5."/>
+      <w:lvlJc w:val="left"/>
+      <w:pPr>
+        <w:ind w:left="3600" w:hanging="360"/>
+      </w:pPr>
+    </w:lvl>
+    <w:lvl w:ilvl="5" w:tplc="0809001B" w:tentative="1">
+      <w:start w:val="1"/>
+      <w:numFmt w:val="lowerRoman"/>
+      <w:lvlText w:val="%6."/>
+      <w:lvlJc w:val="right"/>
+      <w:pPr>
+        <w:ind w:left="4320" w:hanging="180"/>
+      </w:pPr>
+    </w:lvl>
+    <w:lvl w:ilvl="6" w:tplc="0809000F" w:tentative="1">
+      <w:start w:val="1"/>
+      <w:numFmt w:val="decimal"/>
+      <w:lvlText w:val="%7."/>
+      <w:lvlJc w:val="left"/>
+      <w:pPr>
+        <w:ind w:left="5040" w:hanging="360"/>
+      </w:pPr>
+    </w:lvl>
+    <w:lvl w:ilvl="7" w:tplc="08090019" w:tentative="1">
+      <w:start w:val="1"/>
+      <w:numFmt w:val="lowerLetter"/>
+      <w:lvlText w:val="%8."/>
+      <w:lvlJc w:val="left"/>
+      <w:pPr>
+        <w:ind w:left="5760" w:hanging="360"/>
+      </w:pPr>
+    </w:lvl>
+    <w:lvl w:ilvl="8" w:tplc="0809001B" w:tentative="1">
+      <w:start w:val="1"/>
+      <w:numFmt w:val="lowerRoman"/>
+      <w:lvlText w:val="%9."/>
+      <w:lvlJc w:val="right"/>
+      <w:pPr>
+        <w:ind w:left="6480" w:hanging="180"/>
+      </w:pPr>
+    </w:lvl>
+  </w:abstractNum>
   <w:num w:numId="1" w16cid:durableId="1126893892">
-    <w:abstractNumId w:val="11"/>
+    <w:abstractNumId w:val="16"/>
   </w:num>
   <w:num w:numId="2" w16cid:durableId="1775860873">
-    <w:abstractNumId w:val="12"/>
+    <w:abstractNumId w:val="17"/>
   </w:num>
   <w:num w:numId="3" w16cid:durableId="2077849411">
     <w:abstractNumId w:val="8"/>
@@ -4203,10 +5930,10 @@
     <w:abstractNumId w:val="6"/>
   </w:num>
   <w:num w:numId="5" w16cid:durableId="1951233629">
-    <w:abstractNumId w:val="21"/>
+    <w:abstractNumId w:val="27"/>
   </w:num>
   <w:num w:numId="6" w16cid:durableId="1392382496">
-    <w:abstractNumId w:val="17"/>
+    <w:abstractNumId w:val="23"/>
   </w:num>
   <w:num w:numId="7" w16cid:durableId="308100552">
     <w:abstractNumId w:val="7"/>
@@ -4215,61 +5942,82 @@
     <w:abstractNumId w:val="3"/>
   </w:num>
   <w:num w:numId="9" w16cid:durableId="992879236">
-    <w:abstractNumId w:val="13"/>
+    <w:abstractNumId w:val="18"/>
   </w:num>
   <w:num w:numId="10" w16cid:durableId="1988046079">
+    <w:abstractNumId w:val="31"/>
+  </w:num>
+  <w:num w:numId="11" w16cid:durableId="1763060751">
+    <w:abstractNumId w:val="24"/>
+  </w:num>
+  <w:num w:numId="12" w16cid:durableId="613361763">
+    <w:abstractNumId w:val="21"/>
+  </w:num>
+  <w:num w:numId="13" w16cid:durableId="1532766479">
+    <w:abstractNumId w:val="19"/>
+  </w:num>
+  <w:num w:numId="14" w16cid:durableId="379331808">
+    <w:abstractNumId w:val="22"/>
+  </w:num>
+  <w:num w:numId="15" w16cid:durableId="1262225420">
     <w:abstractNumId w:val="25"/>
   </w:num>
-  <w:num w:numId="11" w16cid:durableId="1763060751">
-    <w:abstractNumId w:val="18"/>
-  </w:num>
-  <w:num w:numId="12" w16cid:durableId="613361763">
-    <w:abstractNumId w:val="15"/>
-  </w:num>
-  <w:num w:numId="13" w16cid:durableId="1532766479">
-    <w:abstractNumId w:val="14"/>
-  </w:num>
-  <w:num w:numId="14" w16cid:durableId="379331808">
-    <w:abstractNumId w:val="16"/>
-  </w:num>
-  <w:num w:numId="15" w16cid:durableId="1262225420">
-    <w:abstractNumId w:val="19"/>
-  </w:num>
   <w:num w:numId="16" w16cid:durableId="371927138">
-    <w:abstractNumId w:val="24"/>
+    <w:abstractNumId w:val="30"/>
   </w:num>
   <w:num w:numId="17" w16cid:durableId="2081438510">
-    <w:abstractNumId w:val="23"/>
+    <w:abstractNumId w:val="29"/>
   </w:num>
   <w:num w:numId="18" w16cid:durableId="2125150139">
     <w:abstractNumId w:val="4"/>
   </w:num>
   <w:num w:numId="19" w16cid:durableId="845218120">
-    <w:abstractNumId w:val="26"/>
+    <w:abstractNumId w:val="32"/>
   </w:num>
   <w:num w:numId="20" w16cid:durableId="1942445174">
-    <w:abstractNumId w:val="9"/>
+    <w:abstractNumId w:val="12"/>
   </w:num>
   <w:num w:numId="21" w16cid:durableId="1334912251">
     <w:abstractNumId w:val="1"/>
   </w:num>
   <w:num w:numId="22" w16cid:durableId="1180463123">
-    <w:abstractNumId w:val="10"/>
+    <w:abstractNumId w:val="14"/>
   </w:num>
   <w:num w:numId="23" w16cid:durableId="1828785779">
     <w:abstractNumId w:val="0"/>
   </w:num>
   <w:num w:numId="24" w16cid:durableId="1608583688">
-    <w:abstractNumId w:val="22"/>
+    <w:abstractNumId w:val="28"/>
   </w:num>
   <w:num w:numId="25" w16cid:durableId="2076050523">
     <w:abstractNumId w:val="5"/>
   </w:num>
   <w:num w:numId="26" w16cid:durableId="1706784356">
-    <w:abstractNumId w:val="20"/>
+    <w:abstractNumId w:val="26"/>
   </w:num>
   <w:num w:numId="27" w16cid:durableId="1110592053">
     <w:abstractNumId w:val="2"/>
+  </w:num>
+  <w:num w:numId="28" w16cid:durableId="43868210">
+    <w:abstractNumId w:val="33"/>
+  </w:num>
+  <w:num w:numId="29" w16cid:durableId="1911957972">
+    <w:abstractNumId w:val="11"/>
+  </w:num>
+  <w:num w:numId="30" w16cid:durableId="1039865261">
+    <w:abstractNumId w:val="20"/>
+  </w:num>
+  <w:num w:numId="31" w16cid:durableId="2006008391">
+    <w:abstractNumId w:val="13"/>
+  </w:num>
+  <w:num w:numId="32" w16cid:durableId="1775829636">
+    <w:abstractNumId w:val="9"/>
+  </w:num>
+  <w:num w:numId="33" w16cid:durableId="1031537220">
+    <w:abstractNumId w:val="15"/>
+  </w:num>
+  <w:num w:numId="34" w16cid:durableId="1908300229">
+    <w:abstractNumId w:val="10"/>
   </w:num>
 </w:numbering>
 </file>
@@ -4672,6 +6420,7 @@
   <w:style w:type="paragraph" w:default="1" w:styleId="Normal">
     <w:name w:val="Normal"/>
     <w:qFormat/>
+    <w:rsid w:val="00D908F1"/>
   </w:style>
   <w:style w:type="paragraph" w:styleId="Heading1">
     <w:name w:val="heading 1"/>

</xml_diff>